<commit_message>
Add Windows (WSL 2) setup and test-data check to docs
- Manual: new section 2.3 for WSL 2 + Docker Desktop, test-data
  verification step, Windows troubleshooting rows, tested environment
- README (en/ko): Windows notes and quick check with the 40-sample test data

Co-Authored-By: Claude Fable 5.1 <noreply@anthropic.com>
</commit_message>
<xml_diff>
--- a/docs/[OutdoorRMP]설치메뉴얼.docx
+++ b/docs/[OutdoorRMP]설치메뉴얼.docx
@@ -53,23 +53,7 @@
           <w:szCs w:val="56"/>
         </w:rPr>
         <w:t xml:space="preserve">Radio Map Prediction 기반</w:t>
-      </w:r>
-      <w:r>
-        <w:rPr>
-          <w:rFonts w:ascii="맑은 고딕" w:eastAsia="맑은 고딕" w:hAnsi="맑은 고딕" w:cs="Arial"/>
-          <w:b/>
-          <w:sz w:val="56"/>
-          <w:szCs w:val="56"/>
-        </w:rPr>
         <w:br/>
-      </w:r>
-      <w:r>
-        <w:rPr>
-          <w:rFonts w:ascii="맑은 고딕" w:eastAsia="맑은 고딕" w:hAnsi="맑은 고딕" w:cs="Arial"/>
-          <w:b/>
-          <w:sz w:val="56"/>
-          <w:szCs w:val="56"/>
-        </w:rPr>
         <w:t xml:space="preserve">음영 영역 검출 설치 매뉴얼</w:t>
       </w:r>
     </w:p>
@@ -346,6 +330,28 @@
           <w:rFonts w:ascii="맑은 고딕" w:eastAsia="맑은 고딕" w:hAnsi="맑은 고딕" w:hint="eastAsia"/>
           <w:color w:val="000000"/>
         </w:rPr>
+        <w:t xml:space="preserve">TESTED Windows: Windows 11 25H2 (빌드 26200), WSL 2 Ubuntu 26.04 LTS, Docker Desktop (Docker 29.4.3, Docker Compose 5.1.3), NVIDIA GeForce GTX 1050 (드라이버 560.94) - 2.3 참고, 40샘플 테스트 데이터로 학습과 평가 확인</w:t>
+      </w:r>
+    </w:p>
+    <w:p>
+      <w:pPr>
+        <w:pStyle w:val="aa"/>
+        <w:numPr>
+          <w:ilvl w:val="0"/>
+          <w:numId w:val="6"/>
+        </w:numPr>
+        <w:ind w:leftChars="0"/>
+        <w:jc w:val="left"/>
+        <w:rPr>
+          <w:rFonts w:ascii="맑은 고딕" w:eastAsia="맑은 고딕" w:hAnsi="맑은 고딕"/>
+          <w:color w:val="000000"/>
+        </w:rPr>
+      </w:pPr>
+      <w:r>
+        <w:rPr>
+          <w:rFonts w:ascii="맑은 고딕" w:eastAsia="맑은 고딕" w:hAnsi="맑은 고딕" w:hint="eastAsia"/>
+          <w:color w:val="000000"/>
+        </w:rPr>
         <w:t xml:space="preserve">디스크 여유 공간: 데이터셋 13 GB, 체크포인트 17 GB, Docker 이미지 (베이스 이미지 다운로드 약 4 GB)</w:t>
       </w:r>
     </w:p>
@@ -409,6 +415,24 @@
           <w:color w:val="000000"/>
         </w:rPr>
         <w:t xml:space="preserve">(다른 Linux 배포판도 Docker와 NVIDIA Container Toolkit을 설치하면 같은 방법으로 사용 가능)</w:t>
+      </w:r>
+    </w:p>
+    <w:p>
+      <w:pPr>
+        <w:pStyle w:val="aa"/>
+        <w:ind w:leftChars="0"/>
+        <w:jc w:val="left"/>
+        <w:rPr>
+          <w:rFonts w:ascii="맑은 고딕" w:eastAsia="맑은 고딕" w:hAnsi="맑은 고딕"/>
+          <w:color w:val="000000"/>
+        </w:rPr>
+      </w:pPr>
+      <w:r>
+        <w:rPr>
+          <w:rFonts w:ascii="맑은 고딕" w:eastAsia="맑은 고딕" w:hAnsi="맑은 고딕" w:hint="eastAsia"/>
+          <w:color w:val="000000"/>
+        </w:rPr>
+        <w:t xml:space="preserve">Windows PC는 2.3과 같이 WSL 2와 Docker Desktop을 구성한 뒤 3.0부터 Ubuntu 터미널에서 같은 방법으로 진행한다.</w:t>
       </w:r>
     </w:p>
     <w:p>
@@ -1061,23 +1085,76 @@
     </w:p>
     <w:p>
       <w:pPr>
-        <w:pStyle w:val="10"/>
+        <w:pStyle w:val="21"/>
+        <w:spacing w:before="120"/>
+        <w:ind w:left="236"/>
+        <w:rPr>
+          <w:rFonts w:ascii="맑은 고딕" w:eastAsia="맑은 고딕" w:hAnsi="맑은 고딕"/>
+          <w:color w:val="000000"/>
+        </w:rPr>
+      </w:pPr>
+      <w:r>
+        <w:rPr>
+          <w:rFonts w:ascii="맑은 고딕" w:eastAsia="맑은 고딕" w:hAnsi="맑은 고딕" w:hint="eastAsia"/>
+          <w:color w:val="000000"/>
+        </w:rPr>
+        <w:t xml:space="preserve">2.3 Windows 환경 구축 (WSL 2 + Docker Desktop)</w:t>
+      </w:r>
+    </w:p>
+    <w:p>
+      <w:pPr>
+        <w:pStyle w:val="aa"/>
         <w:numPr>
           <w:ilvl w:val="0"/>
-          <w:numId w:val="8"/>
+          <w:numId w:val="6"/>
         </w:numPr>
+        <w:ind w:leftChars="0"/>
+        <w:jc w:val="left"/>
         <w:rPr>
           <w:rFonts w:ascii="맑은 고딕" w:eastAsia="맑은 고딕" w:hAnsi="맑은 고딕"/>
-          <w:szCs w:val="28"/>
+          <w:color w:val="000000"/>
         </w:rPr>
       </w:pPr>
       <w:r>
         <w:rPr>
           <w:rFonts w:ascii="맑은 고딕" w:eastAsia="맑은 고딕" w:hAnsi="맑은 고딕" w:hint="eastAsia"/>
-          <w:szCs w:val="28"/>
-        </w:rPr>
-        <w:t xml:space="preserve"> 설치 STEP 1 - 소스 코드 다운로드 및 Docker 이미지 생성</w:t>
+          <w:color w:val="000000"/>
+        </w:rPr>
+        <w:t xml:space="preserve">Windows에서는 Docker Engine 대신 Docker Desktop을 설치하고, WSL 2의 Ubuntu 터미널에서 모든 명령을 실행한다.</w:t>
       </w:r>
+    </w:p>
+    <w:p>
+      <w:pPr>
+        <w:pStyle w:val="aa"/>
+        <w:numPr>
+          <w:ilvl w:val="0"/>
+          <w:numId w:val="6"/>
+        </w:numPr>
+        <w:ind w:leftChars="0"/>
+        <w:jc w:val="left"/>
+        <w:rPr>
+          <w:rFonts w:ascii="맑은 고딕" w:eastAsia="맑은 고딕" w:hAnsi="맑은 고딕"/>
+          <w:color w:val="000000"/>
+        </w:rPr>
+      </w:pPr>
+      <w:r>
+        <w:rPr>
+          <w:rFonts w:ascii="맑은 고딕" w:eastAsia="맑은 고딕" w:hAnsi="맑은 고딕" w:hint="eastAsia"/>
+          <w:color w:val="000000"/>
+        </w:rPr>
+        <w:t xml:space="preserve">NVIDIA Container Toolkit은 Docker Desktop에 포함되어 있으므로 별도로 설치하지 않는다. 2.2의 docker 그룹 추가도 필요 없다.</w:t>
+      </w:r>
+    </w:p>
+    <w:p>
+      <w:pPr>
+        <w:pStyle w:val="aa"/>
+        <w:ind w:leftChars="0"/>
+        <w:jc w:val="left"/>
+        <w:rPr>
+          <w:rFonts w:ascii="맑은 고딕" w:eastAsia="맑은 고딕" w:hAnsi="맑은 고딕"/>
+          <w:color w:val="000000"/>
+        </w:rPr>
+      </w:pPr>
     </w:p>
     <w:p>
       <w:pPr>
@@ -1085,7 +1162,7 @@
         <w:keepNext/>
         <w:numPr>
           <w:ilvl w:val="0"/>
-          <w:numId w:val="104"/>
+          <w:numId w:val="110"/>
         </w:numPr>
         <w:ind w:leftChars="0"/>
         <w:jc w:val="left"/>
@@ -1099,7 +1176,7 @@
           <w:rFonts w:ascii="맑은 고딕" w:eastAsia="맑은 고딕" w:hAnsi="맑은 고딕" w:hint="eastAsia"/>
           <w:color w:val="000000"/>
         </w:rPr>
-        <w:t xml:space="preserve">소스 코드 다운로드</w:t>
+        <w:t xml:space="preserve">WSL 2와 Ubuntu 설치</w:t>
       </w:r>
     </w:p>
     <w:tbl>
@@ -1136,7 +1213,7 @@
                 <w:rFonts w:ascii="맑은 고딕" w:eastAsia="맑은 고딕" w:hAnsi="맑은 고딕" w:hint="eastAsia"/>
                 <w:color w:val="000000"/>
               </w:rPr>
-              <w:t xml:space="preserve">// 설치 위치로 이동 (e.g., $ cd ~) 후 아래 수행</w:t>
+              <w:t xml:space="preserve">// PowerShell(관리자 권한)에서 실행</w:t>
             </w:r>
           </w:p>
           <w:p>
@@ -1145,7 +1222,43 @@
               <w:jc w:val="left"/>
             </w:pPr>
             <w:r>
-              <w:t xml:space="preserve">$ git clone https://github.com/james4510/OutdoorRMP.git</w:t>
+              <w:t xml:space="preserve">&gt; wsl --install -d Ubuntu</w:t>
+            </w:r>
+          </w:p>
+          <w:p>
+            <w:pPr>
+              <w:pStyle w:val="aa"/>
+              <w:ind w:leftChars="0" w:left="0"/>
+              <w:jc w:val="left"/>
+              <w:rPr>
+                <w:rFonts w:ascii="맑은 고딕" w:eastAsia="맑은 고딕" w:hAnsi="맑은 고딕"/>
+                <w:color w:val="000000"/>
+              </w:rPr>
+            </w:pPr>
+            <w:r>
+              <w:rPr>
+                <w:rFonts w:ascii="맑은 고딕" w:eastAsia="맑은 고딕" w:hAnsi="맑은 고딕" w:hint="eastAsia"/>
+                <w:color w:val="000000"/>
+              </w:rPr>
+              <w:t xml:space="preserve">// 재부팅 후 Ubuntu 창이 열리면 사용자 이름과 비밀번호를 설정함</w:t>
+            </w:r>
+          </w:p>
+          <w:p>
+            <w:pPr>
+              <w:pStyle w:val="aa"/>
+              <w:ind w:leftChars="0" w:left="0"/>
+              <w:jc w:val="left"/>
+              <w:rPr>
+                <w:rFonts w:ascii="맑은 고딕" w:eastAsia="맑은 고딕" w:hAnsi="맑은 고딕"/>
+                <w:color w:val="000000"/>
+              </w:rPr>
+            </w:pPr>
+            <w:r>
+              <w:rPr>
+                <w:rFonts w:ascii="맑은 고딕" w:eastAsia="맑은 고딕" w:hAnsi="맑은 고딕" w:hint="eastAsia"/>
+                <w:color w:val="000000"/>
+              </w:rPr>
+              <w:t xml:space="preserve">// WSL 버전 확인 (VERSION 열이 2 이어야 함)</w:t>
             </w:r>
           </w:p>
           <w:p>
@@ -1154,7 +1267,7 @@
               <w:jc w:val="left"/>
             </w:pPr>
             <w:r>
-              <w:t xml:space="preserve">$ cd OutdoorRMP</w:t>
+              <w:t xml:space="preserve">&gt; wsl -l -v</w:t>
             </w:r>
           </w:p>
         </w:tc>
@@ -1164,6 +1277,7 @@
       <w:pPr>
         <w:pStyle w:val="aa"/>
         <w:ind w:leftChars="0"/>
+        <w:jc w:val="left"/>
         <w:rPr>
           <w:rFonts w:ascii="맑은 고딕" w:eastAsia="맑은 고딕" w:hAnsi="맑은 고딕"/>
           <w:color w:val="000000"/>
@@ -1176,7 +1290,7 @@
         <w:keepNext/>
         <w:numPr>
           <w:ilvl w:val="0"/>
-          <w:numId w:val="12"/>
+          <w:numId w:val="110"/>
         </w:numPr>
         <w:ind w:leftChars="0"/>
         <w:jc w:val="left"/>
@@ -1190,292 +1304,7 @@
           <w:rFonts w:ascii="맑은 고딕" w:eastAsia="맑은 고딕" w:hAnsi="맑은 고딕" w:hint="eastAsia"/>
           <w:color w:val="000000"/>
         </w:rPr>
-        <w:t xml:space="preserve">위와 같이 할 경우 아래의 모습으로 directory가 생성됨</w:t>
-      </w:r>
-    </w:p>
-    <w:tbl>
-      <w:tblPr>
-        <w:tblStyle w:val="af"/>
-        <w:tblW w:w="0" w:type="auto"/>
-        <w:tblInd w:w="400" w:type="dxa"/>
-        <w:tblLook w:val="04A0" w:firstRow="1" w:lastRow="0" w:firstColumn="1" w:lastColumn="0" w:noHBand="0" w:noVBand="1"/>
-      </w:tblPr>
-      <w:tblGrid>
-        <w:gridCol w:w="8546"/>
-      </w:tblGrid>
-      <w:tr>
-        <w:trPr>
-          <w:cantSplit/>
-        </w:trPr>
-        <w:tc>
-          <w:tcPr>
-            <w:tcW w:w="8928" w:type="dxa"/>
-          </w:tcPr>
-          <w:p>
-            <w:pPr>
-              <w:wordWrap/>
-              <w:adjustRightInd w:val="0"/>
-              <w:spacing w:line="240" w:lineRule="exact"/>
-              <w:jc w:val="left"/>
-              <w:rPr>
-                <w:rFonts w:ascii="Courier New" w:eastAsiaTheme="minorHAnsi" w:hAnsi="Courier New" w:cs="Courier New"/>
-                <w:kern w:val="0"/>
-                <w:szCs w:val="20"/>
-              </w:rPr>
-            </w:pPr>
-            <w:r>
-              <w:rPr>
-                <w:rFonts w:ascii="Courier New" w:eastAsiaTheme="minorHAnsi" w:hAnsi="Courier New" w:cs="Courier New"/>
-                <w:kern w:val="0"/>
-                <w:szCs w:val="20"/>
-              </w:rPr>
-              <w:t xml:space="preserve">OutdoorRMP                 설치 root directory</w:t>
-            </w:r>
-          </w:p>
-          <w:p>
-            <w:pPr>
-              <w:wordWrap/>
-              <w:adjustRightInd w:val="0"/>
-              <w:spacing w:line="240" w:lineRule="exact"/>
-              <w:jc w:val="left"/>
-              <w:rPr>
-                <w:rFonts w:ascii="Courier New" w:eastAsiaTheme="minorHAnsi" w:hAnsi="Courier New" w:cs="Courier New"/>
-                <w:kern w:val="0"/>
-                <w:szCs w:val="20"/>
-              </w:rPr>
-            </w:pPr>
-            <w:r>
-              <w:rPr>
-                <w:rFonts w:ascii="Courier New" w:eastAsiaTheme="minorHAnsi" w:hAnsi="Courier New" w:cs="Courier New"/>
-                <w:kern w:val="0"/>
-                <w:szCs w:val="20"/>
-              </w:rPr>
-              <w:t xml:space="preserve">|-- Dockerfile             Docker 이미지 정의</w:t>
-            </w:r>
-          </w:p>
-          <w:p>
-            <w:pPr>
-              <w:wordWrap/>
-              <w:adjustRightInd w:val="0"/>
-              <w:spacing w:line="240" w:lineRule="exact"/>
-              <w:jc w:val="left"/>
-              <w:rPr>
-                <w:rFonts w:ascii="Courier New" w:eastAsiaTheme="minorHAnsi" w:hAnsi="Courier New" w:cs="Courier New"/>
-                <w:kern w:val="0"/>
-                <w:szCs w:val="20"/>
-              </w:rPr>
-            </w:pPr>
-            <w:r>
-              <w:rPr>
-                <w:rFonts w:ascii="Courier New" w:eastAsiaTheme="minorHAnsi" w:hAnsi="Courier New" w:cs="Courier New"/>
-                <w:kern w:val="0"/>
-                <w:szCs w:val="20"/>
-              </w:rPr>
-              <w:t xml:space="preserve">|-- docker-compose.yml     컨테이너 실행 설정 (GPU: rmp, CPU: rmp-cpu)</w:t>
-            </w:r>
-          </w:p>
-          <w:p>
-            <w:pPr>
-              <w:wordWrap/>
-              <w:adjustRightInd w:val="0"/>
-              <w:spacing w:line="240" w:lineRule="exact"/>
-              <w:jc w:val="left"/>
-              <w:rPr>
-                <w:rFonts w:ascii="Courier New" w:eastAsiaTheme="minorHAnsi" w:hAnsi="Courier New" w:cs="Courier New"/>
-                <w:kern w:val="0"/>
-                <w:szCs w:val="20"/>
-              </w:rPr>
-            </w:pPr>
-            <w:r>
-              <w:rPr>
-                <w:rFonts w:ascii="Courier New" w:eastAsiaTheme="minorHAnsi" w:hAnsi="Courier New" w:cs="Courier New"/>
-                <w:kern w:val="0"/>
-                <w:szCs w:val="20"/>
-              </w:rPr>
-              <w:t xml:space="preserve">|-- docker</w:t>
-            </w:r>
-          </w:p>
-          <w:p>
-            <w:pPr>
-              <w:wordWrap/>
-              <w:adjustRightInd w:val="0"/>
-              <w:spacing w:line="240" w:lineRule="exact"/>
-              <w:jc w:val="left"/>
-              <w:rPr>
-                <w:rFonts w:ascii="Courier New" w:eastAsiaTheme="minorHAnsi" w:hAnsi="Courier New" w:cs="Courier New"/>
-                <w:kern w:val="0"/>
-                <w:szCs w:val="20"/>
-              </w:rPr>
-            </w:pPr>
-            <w:r>
-              <w:rPr>
-                <w:rFonts w:ascii="Courier New" w:eastAsiaTheme="minorHAnsi" w:hAnsi="Courier New" w:cs="Courier New"/>
-                <w:kern w:val="0"/>
-                <w:szCs w:val="20"/>
-              </w:rPr>
-              <w:t xml:space="preserve">|   |-- requirements.txt   이미지에 추가로 설치되는 Python 패키지</w:t>
-            </w:r>
-          </w:p>
-          <w:p>
-            <w:pPr>
-              <w:wordWrap/>
-              <w:adjustRightInd w:val="0"/>
-              <w:spacing w:line="240" w:lineRule="exact"/>
-              <w:jc w:val="left"/>
-              <w:rPr>
-                <w:rFonts w:ascii="Courier New" w:eastAsiaTheme="minorHAnsi" w:hAnsi="Courier New" w:cs="Courier New"/>
-                <w:kern w:val="0"/>
-                <w:szCs w:val="20"/>
-              </w:rPr>
-            </w:pPr>
-            <w:r>
-              <w:rPr>
-                <w:rFonts w:ascii="Courier New" w:eastAsiaTheme="minorHAnsi" w:hAnsi="Courier New" w:cs="Courier New"/>
-                <w:kern w:val="0"/>
-                <w:szCs w:val="20"/>
-              </w:rPr>
-              <w:t xml:space="preserve">|   |-- setup_env.sh       실행 환경 설정 파일(.env) 생성</w:t>
-            </w:r>
-          </w:p>
-          <w:p>
-            <w:pPr>
-              <w:wordWrap/>
-              <w:adjustRightInd w:val="0"/>
-              <w:spacing w:line="240" w:lineRule="exact"/>
-              <w:jc w:val="left"/>
-              <w:rPr>
-                <w:rFonts w:ascii="Courier New" w:eastAsiaTheme="minorHAnsi" w:hAnsi="Courier New" w:cs="Courier New"/>
-                <w:kern w:val="0"/>
-                <w:szCs w:val="20"/>
-              </w:rPr>
-            </w:pPr>
-            <w:r>
-              <w:rPr>
-                <w:rFonts w:ascii="Courier New" w:eastAsiaTheme="minorHAnsi" w:hAnsi="Courier New" w:cs="Courier New"/>
-                <w:kern w:val="0"/>
-                <w:szCs w:val="20"/>
-              </w:rPr>
-              <w:t xml:space="preserve">|-- docs                   설치 매뉴얼</w:t>
-            </w:r>
-          </w:p>
-          <w:p>
-            <w:pPr>
-              <w:wordWrap/>
-              <w:adjustRightInd w:val="0"/>
-              <w:spacing w:line="240" w:lineRule="exact"/>
-              <w:jc w:val="left"/>
-              <w:rPr>
-                <w:rFonts w:ascii="Courier New" w:eastAsiaTheme="minorHAnsi" w:hAnsi="Courier New" w:cs="Courier New"/>
-                <w:kern w:val="0"/>
-                <w:szCs w:val="20"/>
-              </w:rPr>
-            </w:pPr>
-            <w:r>
-              <w:rPr>
-                <w:rFonts w:ascii="Courier New" w:eastAsiaTheme="minorHAnsi" w:hAnsi="Courier New" w:cs="Courier New"/>
-                <w:kern w:val="0"/>
-                <w:szCs w:val="20"/>
-              </w:rPr>
-              <w:t xml:space="preserve">|-- ikeee                  데이터셋, 모델, 학습 코드</w:t>
-            </w:r>
-          </w:p>
-          <w:p>
-            <w:pPr>
-              <w:wordWrap/>
-              <w:adjustRightInd w:val="0"/>
-              <w:spacing w:line="240" w:lineRule="exact"/>
-              <w:jc w:val="left"/>
-              <w:rPr>
-                <w:rFonts w:ascii="Courier New" w:eastAsiaTheme="minorHAnsi" w:hAnsi="Courier New" w:cs="Courier New"/>
-                <w:kern w:val="0"/>
-                <w:szCs w:val="20"/>
-              </w:rPr>
-            </w:pPr>
-            <w:r>
-              <w:rPr>
-                <w:rFonts w:ascii="Courier New" w:eastAsiaTheme="minorHAnsi" w:hAnsi="Courier New" w:cs="Courier New"/>
-                <w:kern w:val="0"/>
-                <w:szCs w:val="20"/>
-              </w:rPr>
-              <w:t xml:space="preserve">|-- scripts                평가, 그림 생성, 설치 확인(check_setup.py) 스크립트</w:t>
-            </w:r>
-          </w:p>
-          <w:p>
-            <w:pPr>
-              <w:wordWrap/>
-              <w:adjustRightInd w:val="0"/>
-              <w:spacing w:line="240" w:lineRule="exact"/>
-              <w:jc w:val="left"/>
-              <w:rPr>
-                <w:rFonts w:ascii="Courier New" w:eastAsiaTheme="minorHAnsi" w:hAnsi="Courier New" w:cs="Courier New"/>
-                <w:kern w:val="0"/>
-                <w:szCs w:val="20"/>
-              </w:rPr>
-            </w:pPr>
-            <w:r>
-              <w:rPr>
-                <w:rFonts w:ascii="Courier New" w:eastAsiaTheme="minorHAnsi" w:hAnsi="Courier New" w:cs="Courier New"/>
-                <w:kern w:val="0"/>
-                <w:szCs w:val="20"/>
-              </w:rPr>
-              <w:t xml:space="preserve">|-- results                논문 결과 (CSV, 그림)</w:t>
-            </w:r>
-          </w:p>
-          <w:p>
-            <w:pPr>
-              <w:wordWrap/>
-              <w:adjustRightInd w:val="0"/>
-              <w:spacing w:line="240" w:lineRule="exact"/>
-              <w:jc w:val="left"/>
-              <w:rPr>
-                <w:rFonts w:ascii="Courier New" w:eastAsiaTheme="minorHAnsi" w:hAnsi="Courier New" w:cs="Courier New"/>
-                <w:kern w:val="0"/>
-                <w:szCs w:val="20"/>
-              </w:rPr>
-            </w:pPr>
-            <w:r>
-              <w:rPr>
-                <w:rFonts w:ascii="Courier New" w:eastAsiaTheme="minorHAnsi" w:hAnsi="Courier New" w:cs="Courier New"/>
-                <w:kern w:val="0"/>
-                <w:szCs w:val="20"/>
-              </w:rPr>
-              <w:t xml:space="preserve">|-- README.md, README.ko.md</w:t>
-            </w:r>
-          </w:p>
-        </w:tc>
-      </w:tr>
-    </w:tbl>
-    <w:p>
-      <w:pPr>
-        <w:pStyle w:val="aa"/>
-        <w:ind w:leftChars="0"/>
-        <w:rPr>
-          <w:rFonts w:ascii="맑은 고딕" w:eastAsia="맑은 고딕" w:hAnsi="맑은 고딕"/>
-          <w:color w:val="000000"/>
-        </w:rPr>
-      </w:pPr>
-    </w:p>
-    <w:p>
-      <w:pPr>
-        <w:pStyle w:val="aa"/>
-        <w:keepNext/>
-        <w:numPr>
-          <w:ilvl w:val="0"/>
-          <w:numId w:val="104"/>
-        </w:numPr>
-        <w:ind w:leftChars="0"/>
-        <w:jc w:val="left"/>
-        <w:rPr>
-          <w:rFonts w:ascii="맑은 고딕" w:eastAsia="맑은 고딕" w:hAnsi="맑은 고딕"/>
-          <w:color w:val="000000"/>
-        </w:rPr>
-      </w:pPr>
-      <w:r>
-        <w:rPr>
-          <w:rFonts w:ascii="맑은 고딕" w:eastAsia="맑은 고딕" w:hAnsi="맑은 고딕" w:hint="eastAsia"/>
-          <w:color w:val="000000"/>
-        </w:rPr>
-        <w:t xml:space="preserve">Docker 이미지 생성</w:t>
+        <w:t xml:space="preserve">NVIDIA 드라이버 확인</w:t>
       </w:r>
     </w:p>
     <w:tbl>
@@ -1512,7 +1341,7 @@
                 <w:rFonts w:ascii="맑은 고딕" w:eastAsia="맑은 고딕" w:hAnsi="맑은 고딕" w:hint="eastAsia"/>
                 <w:color w:val="000000"/>
               </w:rPr>
-              <w:t xml:space="preserve">// OutdoorRMP directory에서 실행</w:t>
+              <w:t xml:space="preserve">// Windows용 NVIDIA 드라이버만 설치하며, WSL 안에는 드라이버를 설치하지 않음</w:t>
             </w:r>
           </w:p>
           <w:p>
@@ -1530,7 +1359,7 @@
                 <w:rFonts w:ascii="맑은 고딕" w:eastAsia="맑은 고딕" w:hAnsi="맑은 고딕" w:hint="eastAsia"/>
                 <w:color w:val="000000"/>
               </w:rPr>
-              <w:t xml:space="preserve">// 처음 실행 시 베이스 이미지(약 4 GB)를 다운로드하므로 시간이 소요됨</w:t>
+              <w:t xml:space="preserve">// PowerShell에서 실행</w:t>
             </w:r>
           </w:p>
           <w:p>
@@ -1539,34 +1368,7 @@
               <w:jc w:val="left"/>
             </w:pPr>
             <w:r>
-              <w:t xml:space="preserve">$ docker compose build</w:t>
-            </w:r>
-          </w:p>
-          <w:p>
-            <w:pPr>
-              <w:pStyle w:val="aa"/>
-              <w:ind w:leftChars="0" w:left="0"/>
-              <w:jc w:val="left"/>
-              <w:rPr>
-                <w:rFonts w:ascii="맑은 고딕" w:eastAsia="맑은 고딕" w:hAnsi="맑은 고딕"/>
-                <w:color w:val="000000"/>
-              </w:rPr>
-            </w:pPr>
-            <w:r>
-              <w:rPr>
-                <w:rFonts w:ascii="맑은 고딕" w:eastAsia="맑은 고딕" w:hAnsi="맑은 고딕" w:hint="eastAsia"/>
-                <w:color w:val="000000"/>
-              </w:rPr>
-              <w:t xml:space="preserve">// 생성된 이미지 확인 (REPOSITORY outdoor-rmp, TAG latest 이미지가 출력되면 성공)</w:t>
-            </w:r>
-          </w:p>
-          <w:p>
-            <w:pPr>
-              <w:pStyle w:val="12"/>
-              <w:jc w:val="left"/>
-            </w:pPr>
-            <w:r>
-              <w:t xml:space="preserve">$ docker images outdoor-rmp</w:t>
+              <w:t xml:space="preserve">&gt; nvidia-smi</w:t>
             </w:r>
           </w:p>
         </w:tc>
@@ -1576,31 +1378,12 @@
       <w:pPr>
         <w:pStyle w:val="aa"/>
         <w:ind w:leftChars="0"/>
+        <w:jc w:val="left"/>
         <w:rPr>
           <w:rFonts w:ascii="맑은 고딕" w:eastAsia="맑은 고딕" w:hAnsi="맑은 고딕"/>
           <w:color w:val="000000"/>
         </w:rPr>
       </w:pPr>
-    </w:p>
-    <w:p>
-      <w:pPr>
-        <w:pStyle w:val="10"/>
-        <w:numPr>
-          <w:ilvl w:val="0"/>
-          <w:numId w:val="8"/>
-        </w:numPr>
-        <w:rPr>
-          <w:rFonts w:ascii="맑은 고딕" w:eastAsia="맑은 고딕" w:hAnsi="맑은 고딕"/>
-          <w:szCs w:val="28"/>
-        </w:rPr>
-      </w:pPr>
-      <w:r>
-        <w:rPr>
-          <w:rFonts w:ascii="맑은 고딕" w:eastAsia="맑은 고딕" w:hAnsi="맑은 고딕" w:hint="eastAsia"/>
-          <w:szCs w:val="28"/>
-        </w:rPr>
-        <w:t xml:space="preserve"> 설치 STEP 2 - 데이터셋 및 체크포인트 배치</w:t>
-      </w:r>
     </w:p>
     <w:p>
       <w:pPr>
@@ -1608,7 +1391,7 @@
         <w:keepNext/>
         <w:numPr>
           <w:ilvl w:val="0"/>
-          <w:numId w:val="105"/>
+          <w:numId w:val="110"/>
         </w:numPr>
         <w:ind w:leftChars="0"/>
         <w:jc w:val="left"/>
@@ -1622,602 +1405,7 @@
           <w:rFonts w:ascii="맑은 고딕" w:eastAsia="맑은 고딕" w:hAnsi="맑은 고딕" w:hint="eastAsia"/>
           <w:color w:val="000000"/>
         </w:rPr>
-        <w:t xml:space="preserve">데이터셋 배치</w:t>
-      </w:r>
-    </w:p>
-    <w:p>
-      <w:pPr>
-        <w:pStyle w:val="aa"/>
-        <w:keepNext/>
-        <w:numPr>
-          <w:ilvl w:val="0"/>
-          <w:numId w:val="6"/>
-        </w:numPr>
-        <w:ind w:leftChars="0"/>
-        <w:jc w:val="left"/>
-        <w:rPr>
-          <w:rFonts w:ascii="맑은 고딕" w:eastAsia="맑은 고딕" w:hAnsi="맑은 고딕"/>
-          <w:color w:val="000000"/>
-        </w:rPr>
-      </w:pPr>
-      <w:r>
-        <w:rPr>
-          <w:rFonts w:ascii="맑은 고딕" w:eastAsia="맑은 고딕" w:hAnsi="맑은 고딕" w:hint="eastAsia"/>
-          <w:color w:val="000000"/>
-        </w:rPr>
-        <w:t xml:space="preserve">데이터셋은 저장소에 포함되지 않으므로 별도로 전달받아 OutdoorRMP/data 에 둔다.</w:t>
-      </w:r>
-    </w:p>
-    <w:tbl>
-      <w:tblPr>
-        <w:tblStyle w:val="af"/>
-        <w:tblW w:w="0" w:type="auto"/>
-        <w:tblInd w:w="400" w:type="dxa"/>
-        <w:tblLook w:val="04A0" w:firstRow="1" w:lastRow="0" w:firstColumn="1" w:lastColumn="0" w:noHBand="0" w:noVBand="1"/>
-      </w:tblPr>
-      <w:tblGrid>
-        <w:gridCol w:w="8546"/>
-      </w:tblGrid>
-      <w:tr>
-        <w:trPr>
-          <w:cantSplit/>
-        </w:trPr>
-        <w:tc>
-          <w:tcPr>
-            <w:tcW w:w="8928" w:type="dxa"/>
-          </w:tcPr>
-          <w:p>
-            <w:pPr>
-              <w:wordWrap/>
-              <w:adjustRightInd w:val="0"/>
-              <w:spacing w:line="240" w:lineRule="exact"/>
-              <w:jc w:val="left"/>
-              <w:rPr>
-                <w:rFonts w:ascii="Courier New" w:eastAsiaTheme="minorHAnsi" w:hAnsi="Courier New" w:cs="Courier New"/>
-                <w:kern w:val="0"/>
-                <w:szCs w:val="20"/>
-              </w:rPr>
-            </w:pPr>
-            <w:r>
-              <w:rPr>
-                <w:rFonts w:ascii="Courier New" w:eastAsiaTheme="minorHAnsi" w:hAnsi="Courier New" w:cs="Courier New"/>
-                <w:kern w:val="0"/>
-                <w:szCs w:val="20"/>
-              </w:rPr>
-              <w:t xml:space="preserve">OutdoorRMP</w:t>
-            </w:r>
-          </w:p>
-          <w:p>
-            <w:pPr>
-              <w:wordWrap/>
-              <w:adjustRightInd w:val="0"/>
-              <w:spacing w:line="240" w:lineRule="exact"/>
-              <w:jc w:val="left"/>
-              <w:rPr>
-                <w:rFonts w:ascii="Courier New" w:eastAsiaTheme="minorHAnsi" w:hAnsi="Courier New" w:cs="Courier New"/>
-                <w:kern w:val="0"/>
-                <w:szCs w:val="20"/>
-              </w:rPr>
-            </w:pPr>
-            <w:r>
-              <w:rPr>
-                <w:rFonts w:ascii="Courier New" w:eastAsiaTheme="minorHAnsi" w:hAnsi="Courier New" w:cs="Courier New"/>
-                <w:kern w:val="0"/>
-                <w:szCs w:val="20"/>
-              </w:rPr>
-              <w:t xml:space="preserve">|-- data</w:t>
-            </w:r>
-          </w:p>
-          <w:p>
-            <w:pPr>
-              <w:wordWrap/>
-              <w:adjustRightInd w:val="0"/>
-              <w:spacing w:line="240" w:lineRule="exact"/>
-              <w:jc w:val="left"/>
-              <w:rPr>
-                <w:rFonts w:ascii="Courier New" w:eastAsiaTheme="minorHAnsi" w:hAnsi="Courier New" w:cs="Courier New"/>
-                <w:kern w:val="0"/>
-                <w:szCs w:val="20"/>
-              </w:rPr>
-            </w:pPr>
-            <w:r>
-              <w:rPr>
-                <w:rFonts w:ascii="Courier New" w:eastAsiaTheme="minorHAnsi" w:hAnsi="Courier New" w:cs="Courier New"/>
-                <w:kern w:val="0"/>
-                <w:szCs w:val="20"/>
-              </w:rPr>
-              <w:t xml:space="preserve">|   |-- stations_position.txt           샘플별 송신기 3개 위치 (2000줄)</w:t>
-            </w:r>
-          </w:p>
-          <w:p>
-            <w:pPr>
-              <w:wordWrap/>
-              <w:adjustRightInd w:val="0"/>
-              <w:spacing w:line="240" w:lineRule="exact"/>
-              <w:jc w:val="left"/>
-              <w:rPr>
-                <w:rFonts w:ascii="Courier New" w:eastAsiaTheme="minorHAnsi" w:hAnsi="Courier New" w:cs="Courier New"/>
-                <w:kern w:val="0"/>
-                <w:szCs w:val="20"/>
-              </w:rPr>
-            </w:pPr>
-            <w:r>
-              <w:rPr>
-                <w:rFonts w:ascii="Courier New" w:eastAsiaTheme="minorHAnsi" w:hAnsi="Courier New" w:cs="Courier New"/>
-                <w:kern w:val="0"/>
-                <w:szCs w:val="20"/>
-              </w:rPr>
-              <w:t xml:space="preserve">|   |-- buildings_position</w:t>
-            </w:r>
-          </w:p>
-          <w:p>
-            <w:pPr>
-              <w:wordWrap/>
-              <w:adjustRightInd w:val="0"/>
-              <w:spacing w:line="240" w:lineRule="exact"/>
-              <w:jc w:val="left"/>
-              <w:rPr>
-                <w:rFonts w:ascii="Courier New" w:eastAsiaTheme="minorHAnsi" w:hAnsi="Courier New" w:cs="Courier New"/>
-                <w:kern w:val="0"/>
-                <w:szCs w:val="20"/>
-              </w:rPr>
-            </w:pPr>
-            <w:r>
-              <w:rPr>
-                <w:rFonts w:ascii="Courier New" w:eastAsiaTheme="minorHAnsi" w:hAnsi="Courier New" w:cs="Courier New"/>
-                <w:kern w:val="0"/>
-                <w:szCs w:val="20"/>
-              </w:rPr>
-              <w:t xml:space="preserve">|   |   |-- buildings_{n}.mat           건물 배치 (n = 1 ~ 2000)</w:t>
-            </w:r>
-          </w:p>
-          <w:p>
-            <w:pPr>
-              <w:wordWrap/>
-              <w:adjustRightInd w:val="0"/>
-              <w:spacing w:line="240" w:lineRule="exact"/>
-              <w:jc w:val="left"/>
-              <w:rPr>
-                <w:rFonts w:ascii="Courier New" w:eastAsiaTheme="minorHAnsi" w:hAnsi="Courier New" w:cs="Courier New"/>
-                <w:kern w:val="0"/>
-                <w:szCs w:val="20"/>
-              </w:rPr>
-            </w:pPr>
-            <w:r>
-              <w:rPr>
-                <w:rFonts w:ascii="Courier New" w:eastAsiaTheme="minorHAnsi" w:hAnsi="Courier New" w:cs="Courier New"/>
-                <w:kern w:val="0"/>
-                <w:szCs w:val="20"/>
-              </w:rPr>
-              <w:t xml:space="preserve">|   |-- receivedpower_1750MHz_mat</w:t>
-            </w:r>
-          </w:p>
-          <w:p>
-            <w:pPr>
-              <w:wordWrap/>
-              <w:adjustRightInd w:val="0"/>
-              <w:spacing w:line="240" w:lineRule="exact"/>
-              <w:jc w:val="left"/>
-              <w:rPr>
-                <w:rFonts w:ascii="Courier New" w:eastAsiaTheme="minorHAnsi" w:hAnsi="Courier New" w:cs="Courier New"/>
-                <w:kern w:val="0"/>
-                <w:szCs w:val="20"/>
-              </w:rPr>
-            </w:pPr>
-            <w:r>
-              <w:rPr>
-                <w:rFonts w:ascii="Courier New" w:eastAsiaTheme="minorHAnsi" w:hAnsi="Courier New" w:cs="Courier New"/>
-                <w:kern w:val="0"/>
-                <w:szCs w:val="20"/>
-              </w:rPr>
-              <w:t xml:space="preserve">|   |   |-- TOTAL_REC_1750MHz_{n}.mat   수신 전력 맵</w:t>
-            </w:r>
-          </w:p>
-          <w:p>
-            <w:pPr>
-              <w:wordWrap/>
-              <w:adjustRightInd w:val="0"/>
-              <w:spacing w:line="240" w:lineRule="exact"/>
-              <w:jc w:val="left"/>
-              <w:rPr>
-                <w:rFonts w:ascii="Courier New" w:eastAsiaTheme="minorHAnsi" w:hAnsi="Courier New" w:cs="Courier New"/>
-                <w:kern w:val="0"/>
-                <w:szCs w:val="20"/>
-              </w:rPr>
-            </w:pPr>
-            <w:r>
-              <w:rPr>
-                <w:rFonts w:ascii="Courier New" w:eastAsiaTheme="minorHAnsi" w:hAnsi="Courier New" w:cs="Courier New"/>
-                <w:kern w:val="0"/>
-                <w:szCs w:val="20"/>
-              </w:rPr>
-              <w:t xml:space="preserve">|   |-- receivedpower_2750MHz_mat</w:t>
-            </w:r>
-          </w:p>
-          <w:p>
-            <w:pPr>
-              <w:wordWrap/>
-              <w:adjustRightInd w:val="0"/>
-              <w:spacing w:line="240" w:lineRule="exact"/>
-              <w:jc w:val="left"/>
-              <w:rPr>
-                <w:rFonts w:ascii="Courier New" w:eastAsiaTheme="minorHAnsi" w:hAnsi="Courier New" w:cs="Courier New"/>
-                <w:kern w:val="0"/>
-                <w:szCs w:val="20"/>
-              </w:rPr>
-            </w:pPr>
-            <w:r>
-              <w:rPr>
-                <w:rFonts w:ascii="Courier New" w:eastAsiaTheme="minorHAnsi" w:hAnsi="Courier New" w:cs="Courier New"/>
-                <w:kern w:val="0"/>
-                <w:szCs w:val="20"/>
-              </w:rPr>
-              <w:t xml:space="preserve">|   |-- receivedpower_3750MHz_mat</w:t>
-            </w:r>
-          </w:p>
-          <w:p>
-            <w:pPr>
-              <w:wordWrap/>
-              <w:adjustRightInd w:val="0"/>
-              <w:spacing w:line="240" w:lineRule="exact"/>
-              <w:jc w:val="left"/>
-              <w:rPr>
-                <w:rFonts w:ascii="Courier New" w:eastAsiaTheme="minorHAnsi" w:hAnsi="Courier New" w:cs="Courier New"/>
-                <w:kern w:val="0"/>
-                <w:szCs w:val="20"/>
-              </w:rPr>
-            </w:pPr>
-            <w:r>
-              <w:rPr>
-                <w:rFonts w:ascii="Courier New" w:eastAsiaTheme="minorHAnsi" w:hAnsi="Courier New" w:cs="Courier New"/>
-                <w:kern w:val="0"/>
-                <w:szCs w:val="20"/>
-              </w:rPr>
-              <w:t xml:space="preserve">|   |-- receivedpower_4750MHz_mat</w:t>
-            </w:r>
-          </w:p>
-          <w:p>
-            <w:pPr>
-              <w:wordWrap/>
-              <w:adjustRightInd w:val="0"/>
-              <w:spacing w:line="240" w:lineRule="exact"/>
-              <w:jc w:val="left"/>
-              <w:rPr>
-                <w:rFonts w:ascii="Courier New" w:eastAsiaTheme="minorHAnsi" w:hAnsi="Courier New" w:cs="Courier New"/>
-                <w:kern w:val="0"/>
-                <w:szCs w:val="20"/>
-              </w:rPr>
-            </w:pPr>
-            <w:r>
-              <w:rPr>
-                <w:rFonts w:ascii="Courier New" w:eastAsiaTheme="minorHAnsi" w:hAnsi="Courier New" w:cs="Courier New"/>
-                <w:kern w:val="0"/>
-                <w:szCs w:val="20"/>
-              </w:rPr>
-              <w:t xml:space="preserve">|   |-- receivedpower_5750MHz_mat</w:t>
-            </w:r>
-          </w:p>
-        </w:tc>
-      </w:tr>
-    </w:tbl>
-    <w:p>
-      <w:pPr>
-        <w:pStyle w:val="aa"/>
-        <w:keepNext/>
-        <w:numPr>
-          <w:ilvl w:val="0"/>
-          <w:numId w:val="12"/>
-        </w:numPr>
-        <w:ind w:leftChars="0"/>
-        <w:jc w:val="left"/>
-        <w:rPr>
-          <w:rFonts w:ascii="맑은 고딕" w:eastAsia="맑은 고딕" w:hAnsi="맑은 고딕"/>
-          <w:color w:val="000000"/>
-        </w:rPr>
-      </w:pPr>
-      <w:r>
-        <w:rPr>
-          <w:rFonts w:ascii="맑은 고딕" w:eastAsia="맑은 고딕" w:hAnsi="맑은 고딕" w:hint="eastAsia"/>
-          <w:color w:val="000000"/>
-        </w:rPr>
-        <w:t xml:space="preserve">다른 위치에 있는 데이터셋은 3)에서 경로를 지정한다.</w:t>
-      </w:r>
-    </w:p>
-    <w:p>
-      <w:pPr>
-        <w:pStyle w:val="aa"/>
-        <w:ind w:leftChars="0"/>
-        <w:rPr>
-          <w:rFonts w:ascii="맑은 고딕" w:eastAsia="맑은 고딕" w:hAnsi="맑은 고딕"/>
-          <w:color w:val="000000"/>
-        </w:rPr>
-      </w:pPr>
-    </w:p>
-    <w:p>
-      <w:pPr>
-        <w:pStyle w:val="aa"/>
-        <w:keepNext/>
-        <w:numPr>
-          <w:ilvl w:val="0"/>
-          <w:numId w:val="105"/>
-        </w:numPr>
-        <w:ind w:leftChars="0"/>
-        <w:jc w:val="left"/>
-        <w:rPr>
-          <w:rFonts w:ascii="맑은 고딕" w:eastAsia="맑은 고딕" w:hAnsi="맑은 고딕"/>
-          <w:color w:val="000000"/>
-        </w:rPr>
-      </w:pPr>
-      <w:r>
-        <w:rPr>
-          <w:rFonts w:ascii="맑은 고딕" w:eastAsia="맑은 고딕" w:hAnsi="맑은 고딕" w:hint="eastAsia"/>
-          <w:color w:val="000000"/>
-        </w:rPr>
-        <w:t xml:space="preserve">체크포인트 배치 (평가 시 필요, 학습만 할 경우 생략)</w:t>
-      </w:r>
-    </w:p>
-    <w:tbl>
-      <w:tblPr>
-        <w:tblStyle w:val="af"/>
-        <w:tblW w:w="0" w:type="auto"/>
-        <w:tblInd w:w="400" w:type="dxa"/>
-        <w:tblLook w:val="04A0" w:firstRow="1" w:lastRow="0" w:firstColumn="1" w:lastColumn="0" w:noHBand="0" w:noVBand="1"/>
-      </w:tblPr>
-      <w:tblGrid>
-        <w:gridCol w:w="8546"/>
-      </w:tblGrid>
-      <w:tr>
-        <w:trPr>
-          <w:cantSplit/>
-        </w:trPr>
-        <w:tc>
-          <w:tcPr>
-            <w:tcW w:w="8928" w:type="dxa"/>
-          </w:tcPr>
-          <w:p>
-            <w:pPr>
-              <w:wordWrap/>
-              <w:adjustRightInd w:val="0"/>
-              <w:spacing w:line="240" w:lineRule="exact"/>
-              <w:jc w:val="left"/>
-              <w:rPr>
-                <w:rFonts w:ascii="Courier New" w:eastAsiaTheme="minorHAnsi" w:hAnsi="Courier New" w:cs="Courier New"/>
-                <w:kern w:val="0"/>
-                <w:szCs w:val="20"/>
-              </w:rPr>
-            </w:pPr>
-            <w:r>
-              <w:rPr>
-                <w:rFonts w:ascii="Courier New" w:eastAsiaTheme="minorHAnsi" w:hAnsi="Courier New" w:cs="Courier New"/>
-                <w:kern w:val="0"/>
-                <w:szCs w:val="20"/>
-              </w:rPr>
-              <w:t xml:space="preserve">OutdoorRMP</w:t>
-            </w:r>
-          </w:p>
-          <w:p>
-            <w:pPr>
-              <w:wordWrap/>
-              <w:adjustRightInd w:val="0"/>
-              <w:spacing w:line="240" w:lineRule="exact"/>
-              <w:jc w:val="left"/>
-              <w:rPr>
-                <w:rFonts w:ascii="Courier New" w:eastAsiaTheme="minorHAnsi" w:hAnsi="Courier New" w:cs="Courier New"/>
-                <w:kern w:val="0"/>
-                <w:szCs w:val="20"/>
-              </w:rPr>
-            </w:pPr>
-            <w:r>
-              <w:rPr>
-                <w:rFonts w:ascii="Courier New" w:eastAsiaTheme="minorHAnsi" w:hAnsi="Courier New" w:cs="Courier New"/>
-                <w:kern w:val="0"/>
-                <w:szCs w:val="20"/>
-              </w:rPr>
-              <w:t xml:space="preserve">|-- model_checkpoints</w:t>
-            </w:r>
-          </w:p>
-          <w:p>
-            <w:pPr>
-              <w:wordWrap/>
-              <w:adjustRightInd w:val="0"/>
-              <w:spacing w:line="240" w:lineRule="exact"/>
-              <w:jc w:val="left"/>
-              <w:rPr>
-                <w:rFonts w:ascii="Courier New" w:eastAsiaTheme="minorHAnsi" w:hAnsi="Courier New" w:cs="Courier New"/>
-                <w:kern w:val="0"/>
-                <w:szCs w:val="20"/>
-              </w:rPr>
-            </w:pPr>
-            <w:r>
-              <w:rPr>
-                <w:rFonts w:ascii="Courier New" w:eastAsiaTheme="minorHAnsi" w:hAnsi="Courier New" w:cs="Courier New"/>
-                <w:kern w:val="0"/>
-                <w:szCs w:val="20"/>
-              </w:rPr>
-              <w:t xml:space="preserve">|   |-- checkpoints_radiounet_small_{freq}/best.pth</w:t>
-            </w:r>
-          </w:p>
-          <w:p>
-            <w:pPr>
-              <w:wordWrap/>
-              <w:adjustRightInd w:val="0"/>
-              <w:spacing w:line="240" w:lineRule="exact"/>
-              <w:jc w:val="left"/>
-              <w:rPr>
-                <w:rFonts w:ascii="Courier New" w:eastAsiaTheme="minorHAnsi" w:hAnsi="Courier New" w:cs="Courier New"/>
-                <w:kern w:val="0"/>
-                <w:szCs w:val="20"/>
-              </w:rPr>
-            </w:pPr>
-            <w:r>
-              <w:rPr>
-                <w:rFonts w:ascii="Courier New" w:eastAsiaTheme="minorHAnsi" w:hAnsi="Courier New" w:cs="Courier New"/>
-                <w:kern w:val="0"/>
-                <w:szCs w:val="20"/>
-              </w:rPr>
-              <w:t xml:space="preserve">|   |-- checkpoints_radiounet_medium_{freq}/best.pth</w:t>
-            </w:r>
-          </w:p>
-          <w:p>
-            <w:pPr>
-              <w:wordWrap/>
-              <w:adjustRightInd w:val="0"/>
-              <w:spacing w:line="240" w:lineRule="exact"/>
-              <w:jc w:val="left"/>
-              <w:rPr>
-                <w:rFonts w:ascii="Courier New" w:eastAsiaTheme="minorHAnsi" w:hAnsi="Courier New" w:cs="Courier New"/>
-                <w:kern w:val="0"/>
-                <w:szCs w:val="20"/>
-              </w:rPr>
-            </w:pPr>
-            <w:r>
-              <w:rPr>
-                <w:rFonts w:ascii="Courier New" w:eastAsiaTheme="minorHAnsi" w:hAnsi="Courier New" w:cs="Courier New"/>
-                <w:kern w:val="0"/>
-                <w:szCs w:val="20"/>
-              </w:rPr>
-              <w:t xml:space="preserve">|   |-- checkpoints_transpathnet_small_{freq}/best.pth</w:t>
-            </w:r>
-          </w:p>
-          <w:p>
-            <w:pPr>
-              <w:wordWrap/>
-              <w:adjustRightInd w:val="0"/>
-              <w:spacing w:line="240" w:lineRule="exact"/>
-              <w:jc w:val="left"/>
-              <w:rPr>
-                <w:rFonts w:ascii="Courier New" w:eastAsiaTheme="minorHAnsi" w:hAnsi="Courier New" w:cs="Courier New"/>
-                <w:kern w:val="0"/>
-                <w:szCs w:val="20"/>
-              </w:rPr>
-            </w:pPr>
-            <w:r>
-              <w:rPr>
-                <w:rFonts w:ascii="Courier New" w:eastAsiaTheme="minorHAnsi" w:hAnsi="Courier New" w:cs="Courier New"/>
-                <w:kern w:val="0"/>
-                <w:szCs w:val="20"/>
-              </w:rPr>
-              <w:t xml:space="preserve">|   |-- checkpoints_transpathnet_base_{freq}/best.pth</w:t>
-            </w:r>
-          </w:p>
-          <w:p>
-            <w:pPr>
-              <w:wordWrap/>
-              <w:adjustRightInd w:val="0"/>
-              <w:spacing w:line="240" w:lineRule="exact"/>
-              <w:jc w:val="left"/>
-              <w:rPr>
-                <w:rFonts w:ascii="Courier New" w:eastAsiaTheme="minorHAnsi" w:hAnsi="Courier New" w:cs="Courier New"/>
-                <w:kern w:val="0"/>
-                <w:szCs w:val="20"/>
-              </w:rPr>
-            </w:pPr>
-            <w:r>
-              <w:rPr>
-                <w:rFonts w:ascii="Courier New" w:eastAsiaTheme="minorHAnsi" w:hAnsi="Courier New" w:cs="Courier New"/>
-                <w:kern w:val="0"/>
-                <w:szCs w:val="20"/>
-              </w:rPr>
-              <w:t xml:space="preserve">|   |-- checkpoints_radiounet_small_4750_v2/best.pth</w:t>
-            </w:r>
-          </w:p>
-          <w:p>
-            <w:pPr>
-              <w:wordWrap/>
-              <w:adjustRightInd w:val="0"/>
-              <w:spacing w:line="240" w:lineRule="exact"/>
-              <w:jc w:val="left"/>
-              <w:rPr>
-                <w:rFonts w:ascii="Courier New" w:eastAsiaTheme="minorHAnsi" w:hAnsi="Courier New" w:cs="Courier New"/>
-                <w:kern w:val="0"/>
-                <w:szCs w:val="20"/>
-              </w:rPr>
-            </w:pPr>
-            <w:r>
-              <w:rPr>
-                <w:rFonts w:ascii="Courier New" w:eastAsiaTheme="minorHAnsi" w:hAnsi="Courier New" w:cs="Courier New"/>
-                <w:kern w:val="0"/>
-                <w:szCs w:val="20"/>
-              </w:rPr>
-              <w:t xml:space="preserve"/>
-            </w:r>
-          </w:p>
-          <w:p>
-            <w:pPr>
-              <w:wordWrap/>
-              <w:adjustRightInd w:val="0"/>
-              <w:spacing w:line="240" w:lineRule="exact"/>
-              <w:jc w:val="left"/>
-              <w:rPr>
-                <w:rFonts w:ascii="Courier New" w:eastAsiaTheme="minorHAnsi" w:hAnsi="Courier New" w:cs="Courier New"/>
-                <w:kern w:val="0"/>
-                <w:szCs w:val="20"/>
-              </w:rPr>
-            </w:pPr>
-            <w:r>
-              <w:rPr>
-                <w:rFonts w:ascii="Courier New" w:eastAsiaTheme="minorHAnsi" w:hAnsi="Courier New" w:cs="Courier New"/>
-                <w:kern w:val="0"/>
-                <w:szCs w:val="20"/>
-              </w:rPr>
-              <w:t xml:space="preserve">{freq}: 1750, 2750, 3750, 4750, 5750</w:t>
-            </w:r>
-          </w:p>
-          <w:p>
-            <w:pPr>
-              <w:wordWrap/>
-              <w:adjustRightInd w:val="0"/>
-              <w:spacing w:line="240" w:lineRule="exact"/>
-              <w:jc w:val="left"/>
-              <w:rPr>
-                <w:rFonts w:ascii="Courier New" w:eastAsiaTheme="minorHAnsi" w:hAnsi="Courier New" w:cs="Courier New"/>
-                <w:kern w:val="0"/>
-                <w:szCs w:val="20"/>
-              </w:rPr>
-            </w:pPr>
-            <w:r>
-              <w:rPr>
-                <w:rFonts w:ascii="Courier New" w:eastAsiaTheme="minorHAnsi" w:hAnsi="Courier New" w:cs="Courier New"/>
-                <w:kern w:val="0"/>
-                <w:szCs w:val="20"/>
-              </w:rPr>
-              <w:t xml:space="preserve">_v2: 있으면 4750 MHz RadioUNet-S 평가에 사용</w:t>
-            </w:r>
-          </w:p>
-        </w:tc>
-      </w:tr>
-    </w:tbl>
-    <w:p>
-      <w:pPr>
-        <w:pStyle w:val="aa"/>
-        <w:ind w:leftChars="0"/>
-        <w:rPr>
-          <w:rFonts w:ascii="맑은 고딕" w:eastAsia="맑은 고딕" w:hAnsi="맑은 고딕"/>
-          <w:color w:val="000000"/>
-        </w:rPr>
-      </w:pPr>
-    </w:p>
-    <w:p>
-      <w:pPr>
-        <w:pStyle w:val="aa"/>
-        <w:keepNext/>
-        <w:numPr>
-          <w:ilvl w:val="0"/>
-          <w:numId w:val="105"/>
-        </w:numPr>
-        <w:ind w:leftChars="0"/>
-        <w:jc w:val="left"/>
-        <w:rPr>
-          <w:rFonts w:ascii="맑은 고딕" w:eastAsia="맑은 고딕" w:hAnsi="맑은 고딕"/>
-          <w:color w:val="000000"/>
-        </w:rPr>
-      </w:pPr>
-      <w:r>
-        <w:rPr>
-          <w:rFonts w:ascii="맑은 고딕" w:eastAsia="맑은 고딕" w:hAnsi="맑은 고딕" w:hint="eastAsia"/>
-          <w:color w:val="000000"/>
-        </w:rPr>
-        <w:t xml:space="preserve">실행 환경 설정 파일(.env) 생성</w:t>
+        <w:t xml:space="preserve">Docker Desktop 설치 및 WSL 연동</w:t>
       </w:r>
     </w:p>
     <w:tbl>
@@ -2254,16 +1442,7 @@
                 <w:rFonts w:ascii="맑은 고딕" w:eastAsia="맑은 고딕" w:hAnsi="맑은 고딕" w:hint="eastAsia"/>
                 <w:color w:val="000000"/>
               </w:rPr>
-              <w:t xml:space="preserve">// 데이터셋과 체크포인트가 OutdoorRMP 안에 있는 경우</w:t>
-            </w:r>
-          </w:p>
-          <w:p>
-            <w:pPr>
-              <w:pStyle w:val="12"/>
-              <w:jc w:val="left"/>
-            </w:pPr>
-            <w:r>
-              <w:t xml:space="preserve">$ bash docker/setup_env.sh</w:t>
+              <w:t xml:space="preserve">// https://www.docker.com/products/docker-desktop 에서 설치 (WSL 2 backend 사용)</w:t>
             </w:r>
           </w:p>
           <w:p>
@@ -2281,16 +1460,7 @@
                 <w:rFonts w:ascii="맑은 고딕" w:eastAsia="맑은 고딕" w:hAnsi="맑은 고딕" w:hint="eastAsia"/>
                 <w:color w:val="000000"/>
               </w:rPr>
-              <w:t xml:space="preserve">// 다른 위치에 있는 경우 경로 지정</w:t>
-            </w:r>
-          </w:p>
-          <w:p>
-            <w:pPr>
-              <w:pStyle w:val="12"/>
-              <w:jc w:val="left"/>
-            </w:pPr>
-            <w:r>
-              <w:t xml:space="preserve">$ bash docker/setup_env.sh /path/to/data /path/to/model_checkpoints</w:t>
+              <w:t xml:space="preserve">// Docker Desktop 실행 후 Settings &gt; Resources &gt; WSL integration 에서 Ubuntu 를 켜고 Apply &amp; restart</w:t>
             </w:r>
           </w:p>
           <w:p>
@@ -2308,162 +1478,52 @@
                 <w:rFonts w:ascii="맑은 고딕" w:eastAsia="맑은 고딕" w:hAnsi="맑은 고딕" w:hint="eastAsia"/>
                 <w:color w:val="000000"/>
               </w:rPr>
-              <w:t xml:space="preserve">// 생성 결과 예시</w:t>
-            </w:r>
-          </w:p>
-          <w:p>
-            <w:pPr>
-              <w:pStyle w:val="HTML"/>
-              <w:pBdr>
-                <w:top w:val="single" w:sz="6" w:space="6" w:color="CCCCCC"/>
-                <w:left w:val="single" w:sz="6" w:space="6" w:color="CCCCCC"/>
-                <w:bottom w:val="single" w:sz="6" w:space="6" w:color="CCCCCC"/>
-                <w:right w:val="single" w:sz="6" w:space="6" w:color="CCCCCC"/>
-              </w:pBdr>
-              <w:shd w:val="clear" w:color="auto" w:fill="F8F8F8"/>
-              <w:spacing w:line="239" w:lineRule="atLeast"/>
-              <w:jc w:val="left"/>
-              <w:rPr>
-                <w:rFonts w:ascii="Consolas" w:hAnsi="Consolas" w:cs="Consolas"/>
-                <w:color w:val="000000"/>
-                <w:spacing w:val="4"/>
-                <w:sz w:val="20"/>
-                <w:szCs w:val="20"/>
-              </w:rPr>
-            </w:pPr>
-            <w:r>
-              <w:rPr>
-                <w:rFonts w:ascii="Consolas" w:hAnsi="Consolas" w:cs="Consolas"/>
-                <w:color w:val="000000"/>
-                <w:spacing w:val="4"/>
-                <w:sz w:val="20"/>
-                <w:szCs w:val="20"/>
-              </w:rPr>
-              <w:t xml:space="preserve">Created /home/user/OutdoorRMP/.env</w:t>
-            </w:r>
-          </w:p>
-          <w:p>
-            <w:pPr>
-              <w:pStyle w:val="HTML"/>
-              <w:pBdr>
-                <w:top w:val="single" w:sz="6" w:space="6" w:color="CCCCCC"/>
-                <w:left w:val="single" w:sz="6" w:space="6" w:color="CCCCCC"/>
-                <w:bottom w:val="single" w:sz="6" w:space="6" w:color="CCCCCC"/>
-                <w:right w:val="single" w:sz="6" w:space="6" w:color="CCCCCC"/>
-              </w:pBdr>
-              <w:shd w:val="clear" w:color="auto" w:fill="F8F8F8"/>
-              <w:spacing w:line="239" w:lineRule="atLeast"/>
-              <w:jc w:val="left"/>
-              <w:rPr>
-                <w:rFonts w:ascii="Consolas" w:hAnsi="Consolas" w:cs="Consolas"/>
-                <w:color w:val="000000"/>
-                <w:spacing w:val="4"/>
-                <w:sz w:val="20"/>
-                <w:szCs w:val="20"/>
-              </w:rPr>
-            </w:pPr>
-            <w:r>
-              <w:rPr>
-                <w:rFonts w:ascii="Consolas" w:hAnsi="Consolas" w:cs="Consolas"/>
-                <w:color w:val="000000"/>
-                <w:spacing w:val="4"/>
-                <w:sz w:val="20"/>
-                <w:szCs w:val="20"/>
-              </w:rPr>
-              <w:t xml:space="preserve">HOST_UID=1000</w:t>
-            </w:r>
-          </w:p>
-          <w:p>
-            <w:pPr>
-              <w:pStyle w:val="HTML"/>
-              <w:pBdr>
-                <w:top w:val="single" w:sz="6" w:space="6" w:color="CCCCCC"/>
-                <w:left w:val="single" w:sz="6" w:space="6" w:color="CCCCCC"/>
-                <w:bottom w:val="single" w:sz="6" w:space="6" w:color="CCCCCC"/>
-                <w:right w:val="single" w:sz="6" w:space="6" w:color="CCCCCC"/>
-              </w:pBdr>
-              <w:shd w:val="clear" w:color="auto" w:fill="F8F8F8"/>
-              <w:spacing w:line="239" w:lineRule="atLeast"/>
-              <w:jc w:val="left"/>
-              <w:rPr>
-                <w:rFonts w:ascii="Consolas" w:hAnsi="Consolas" w:cs="Consolas"/>
-                <w:color w:val="000000"/>
-                <w:spacing w:val="4"/>
-                <w:sz w:val="20"/>
-                <w:szCs w:val="20"/>
-              </w:rPr>
-            </w:pPr>
-            <w:r>
-              <w:rPr>
-                <w:rFonts w:ascii="Consolas" w:hAnsi="Consolas" w:cs="Consolas"/>
-                <w:color w:val="000000"/>
-                <w:spacing w:val="4"/>
-                <w:sz w:val="20"/>
-                <w:szCs w:val="20"/>
-              </w:rPr>
-              <w:t xml:space="preserve">HOST_GID=1000</w:t>
-            </w:r>
-          </w:p>
-          <w:p>
-            <w:pPr>
-              <w:pStyle w:val="HTML"/>
-              <w:pBdr>
-                <w:top w:val="single" w:sz="6" w:space="6" w:color="CCCCCC"/>
-                <w:left w:val="single" w:sz="6" w:space="6" w:color="CCCCCC"/>
-                <w:bottom w:val="single" w:sz="6" w:space="6" w:color="CCCCCC"/>
-                <w:right w:val="single" w:sz="6" w:space="6" w:color="CCCCCC"/>
-              </w:pBdr>
-              <w:shd w:val="clear" w:color="auto" w:fill="F8F8F8"/>
-              <w:spacing w:line="239" w:lineRule="atLeast"/>
-              <w:jc w:val="left"/>
-              <w:rPr>
-                <w:rFonts w:ascii="Consolas" w:hAnsi="Consolas" w:cs="Consolas"/>
-                <w:color w:val="000000"/>
-                <w:spacing w:val="4"/>
-                <w:sz w:val="20"/>
-                <w:szCs w:val="20"/>
-              </w:rPr>
-            </w:pPr>
-            <w:r>
-              <w:rPr>
-                <w:rFonts w:ascii="Consolas" w:hAnsi="Consolas" w:cs="Consolas"/>
-                <w:color w:val="000000"/>
-                <w:spacing w:val="4"/>
-                <w:sz w:val="20"/>
-                <w:szCs w:val="20"/>
-              </w:rPr>
-              <w:t xml:space="preserve">DATA_DIR=/home/user/OutdoorRMP/data</w:t>
-            </w:r>
-          </w:p>
-          <w:p>
-            <w:pPr>
-              <w:pStyle w:val="HTML"/>
-              <w:pBdr>
-                <w:top w:val="single" w:sz="6" w:space="6" w:color="CCCCCC"/>
-                <w:left w:val="single" w:sz="6" w:space="6" w:color="CCCCCC"/>
-                <w:bottom w:val="single" w:sz="6" w:space="6" w:color="CCCCCC"/>
-                <w:right w:val="single" w:sz="6" w:space="6" w:color="CCCCCC"/>
-              </w:pBdr>
-              <w:shd w:val="clear" w:color="auto" w:fill="F8F8F8"/>
-              <w:spacing w:line="239" w:lineRule="atLeast"/>
-              <w:jc w:val="left"/>
-              <w:rPr>
-                <w:rFonts w:ascii="Consolas" w:hAnsi="Consolas" w:cs="Consolas"/>
-                <w:color w:val="000000"/>
-                <w:spacing w:val="4"/>
-                <w:sz w:val="20"/>
-                <w:szCs w:val="20"/>
-              </w:rPr>
-            </w:pPr>
-            <w:r>
-              <w:rPr>
-                <w:rFonts w:ascii="Consolas" w:hAnsi="Consolas" w:cs="Consolas"/>
-                <w:color w:val="000000"/>
-                <w:spacing w:val="4"/>
-                <w:sz w:val="20"/>
-                <w:szCs w:val="20"/>
-              </w:rPr>
-              <w:t xml:space="preserve">CKPT_DIR=/home/user/OutdoorRMP/model_checkpoints</w:t>
+              <w:t xml:space="preserve">// Ubuntu 터미널에서 확인</w:t>
+            </w:r>
+          </w:p>
+          <w:p>
+            <w:pPr>
+              <w:pStyle w:val="12"/>
+              <w:jc w:val="left"/>
+            </w:pPr>
+            <w:r>
+              <w:t xml:space="preserve">$ docker --version</w:t>
+            </w:r>
+          </w:p>
+          <w:p>
+            <w:pPr>
+              <w:pStyle w:val="12"/>
+              <w:jc w:val="left"/>
+            </w:pPr>
+            <w:r>
+              <w:t xml:space="preserve">$ docker compose version</w:t>
+            </w:r>
+          </w:p>
+          <w:p>
+            <w:pPr>
+              <w:pStyle w:val="aa"/>
+              <w:ind w:leftChars="0" w:left="0"/>
+              <w:jc w:val="left"/>
+              <w:rPr>
+                <w:rFonts w:ascii="맑은 고딕" w:eastAsia="맑은 고딕" w:hAnsi="맑은 고딕"/>
+                <w:color w:val="000000"/>
+              </w:rPr>
+            </w:pPr>
+            <w:r>
+              <w:rPr>
+                <w:rFonts w:ascii="맑은 고딕" w:eastAsia="맑은 고딕" w:hAnsi="맑은 고딕" w:hint="eastAsia"/>
+                <w:color w:val="000000"/>
+              </w:rPr>
+              <w:t xml:space="preserve">// 컨테이너에서 GPU 확인</w:t>
+            </w:r>
+          </w:p>
+          <w:p>
+            <w:pPr>
+              <w:pStyle w:val="12"/>
+              <w:jc w:val="left"/>
+            </w:pPr>
+            <w:r>
+              <w:t xml:space="preserve">$ docker run --rm --gpus all nvidia/cuda:11.8.0-base-ubuntu22.04 nvidia-smi</w:t>
             </w:r>
           </w:p>
         </w:tc>
@@ -2484,13 +1544,14 @@
           <w:rFonts w:ascii="맑은 고딕" w:eastAsia="맑은 고딕" w:hAnsi="맑은 고딕" w:hint="eastAsia"/>
           <w:color w:val="000000"/>
         </w:rPr>
-        <w:t xml:space="preserve">※ HOST_UID, HOST_GID는 컨테이너가 만든 결과 파일의 소유자를 현재 사용자로 맞추는 값이다.</w:t>
+        <w:t xml:space="preserve">※ Ubuntu 터미널에서 The command 'docker' could not be found in this WSL 2 distro 가 출력되면 WSL integration이 꺼진 상태이다. Docker Desktop 설정에서 켠 뒤 Ubuntu 터미널을 다시 연다.</w:t>
       </w:r>
     </w:p>
     <w:p>
       <w:pPr>
         <w:pStyle w:val="aa"/>
         <w:ind w:leftChars="0"/>
+        <w:jc w:val="left"/>
         <w:rPr>
           <w:rFonts w:ascii="맑은 고딕" w:eastAsia="맑은 고딕" w:hAnsi="맑은 고딕"/>
           <w:color w:val="000000"/>
@@ -2503,7 +1564,7 @@
         <w:keepNext/>
         <w:numPr>
           <w:ilvl w:val="0"/>
-          <w:numId w:val="105"/>
+          <w:numId w:val="110"/>
         </w:numPr>
         <w:ind w:leftChars="0"/>
         <w:jc w:val="left"/>
@@ -2517,7 +1578,29 @@
           <w:rFonts w:ascii="맑은 고딕" w:eastAsia="맑은 고딕" w:hAnsi="맑은 고딕" w:hint="eastAsia"/>
           <w:color w:val="000000"/>
         </w:rPr>
-        <w:t xml:space="preserve">설치 확인</w:t>
+        <w:t xml:space="preserve">작업 위치와 파일 복사</w:t>
+      </w:r>
+    </w:p>
+    <w:p>
+      <w:pPr>
+        <w:pStyle w:val="aa"/>
+        <w:numPr>
+          <w:ilvl w:val="0"/>
+          <w:numId w:val="6"/>
+        </w:numPr>
+        <w:ind w:leftChars="0"/>
+        <w:jc w:val="left"/>
+        <w:rPr>
+          <w:rFonts w:ascii="맑은 고딕" w:eastAsia="맑은 고딕" w:hAnsi="맑은 고딕"/>
+          <w:color w:val="000000"/>
+        </w:rPr>
+      </w:pPr>
+      <w:r>
+        <w:rPr>
+          <w:rFonts w:ascii="맑은 고딕" w:eastAsia="맑은 고딕" w:hAnsi="맑은 고딕" w:hint="eastAsia"/>
+          <w:color w:val="000000"/>
+        </w:rPr>
+        <w:t xml:space="preserve">소스 코드, 데이터셋, 체크포인트는 WSL 홈 디렉토리(예: /home/&lt;user&gt;/OutdoorRMP) 아래에 둔다. /mnt/c 아래의 Windows 경로는 파일 접근이 느리다.</w:t>
       </w:r>
     </w:p>
     <w:tbl>
@@ -2541,11 +1624,1371 @@
           </w:tcPr>
           <w:p>
             <w:pPr>
+              <w:pStyle w:val="aa"/>
+              <w:ind w:leftChars="0" w:left="0"/>
+              <w:jc w:val="left"/>
+              <w:rPr>
+                <w:rFonts w:ascii="맑은 고딕" w:eastAsia="맑은 고딕" w:hAnsi="맑은 고딕"/>
+                <w:color w:val="000000"/>
+              </w:rPr>
+            </w:pPr>
+            <w:r>
+              <w:rPr>
+                <w:rFonts w:ascii="맑은 고딕" w:eastAsia="맑은 고딕" w:hAnsi="맑은 고딕" w:hint="eastAsia"/>
+                <w:color w:val="000000"/>
+              </w:rPr>
+              <w:t xml:space="preserve">// Windows에 내려받은 파일을 WSL 홈으로 복사</w:t>
+            </w:r>
+          </w:p>
+          <w:p>
+            <w:pPr>
               <w:pStyle w:val="12"/>
               <w:jc w:val="left"/>
             </w:pPr>
             <w:r>
-              <w:t xml:space="preserve">$ docker compose run --rm rmp python scripts/check_setup.py</w:t>
+              <w:t xml:space="preserve">$ cp /mnt/c/Users/&lt;Windows 사용자&gt;/Downloads/&lt;파일명&gt; ~/</w:t>
+            </w:r>
+          </w:p>
+          <w:p>
+            <w:pPr>
+              <w:pStyle w:val="aa"/>
+              <w:ind w:leftChars="0" w:left="0"/>
+              <w:jc w:val="left"/>
+              <w:rPr>
+                <w:rFonts w:ascii="맑은 고딕" w:eastAsia="맑은 고딕" w:hAnsi="맑은 고딕"/>
+                <w:color w:val="000000"/>
+              </w:rPr>
+            </w:pPr>
+            <w:r>
+              <w:rPr>
+                <w:rFonts w:ascii="맑은 고딕" w:eastAsia="맑은 고딕" w:hAnsi="맑은 고딕" w:hint="eastAsia"/>
+                <w:color w:val="000000"/>
+              </w:rPr>
+              <w:t xml:space="preserve">// 또는 Windows 탐색기 주소창에 \\wsl$\Ubuntu\home\&lt;user&gt; 를 입력하여 복사</w:t>
+            </w:r>
+          </w:p>
+          <w:p>
+            <w:pPr>
+              <w:pStyle w:val="aa"/>
+              <w:ind w:leftChars="0" w:left="0"/>
+              <w:jc w:val="left"/>
+              <w:rPr>
+                <w:rFonts w:ascii="맑은 고딕" w:eastAsia="맑은 고딕" w:hAnsi="맑은 고딕"/>
+                <w:color w:val="000000"/>
+              </w:rPr>
+            </w:pPr>
+            <w:r>
+              <w:rPr>
+                <w:rFonts w:ascii="맑은 고딕" w:eastAsia="맑은 고딕" w:hAnsi="맑은 고딕" w:hint="eastAsia"/>
+                <w:color w:val="000000"/>
+              </w:rPr>
+              <w:t xml:space="preserve">// Ubuntu 터미널을 닫았다가 다시 열 때 (PowerShell에서 wsl 입력 또는 시작 메뉴의 Ubuntu 실행)</w:t>
+            </w:r>
+          </w:p>
+          <w:p>
+            <w:pPr>
+              <w:pStyle w:val="12"/>
+              <w:jc w:val="left"/>
+            </w:pPr>
+            <w:r>
+              <w:t xml:space="preserve">&gt; wsl</w:t>
+            </w:r>
+          </w:p>
+          <w:p>
+            <w:pPr>
+              <w:pStyle w:val="12"/>
+              <w:jc w:val="left"/>
+            </w:pPr>
+            <w:r>
+              <w:t xml:space="preserve">$ cd ~/OutdoorRMP</w:t>
+            </w:r>
+          </w:p>
+        </w:tc>
+      </w:tr>
+    </w:tbl>
+    <w:p>
+      <w:pPr>
+        <w:pStyle w:val="aa"/>
+        <w:numPr>
+          <w:ilvl w:val="0"/>
+          <w:numId w:val="6"/>
+        </w:numPr>
+        <w:ind w:leftChars="0"/>
+        <w:jc w:val="left"/>
+        <w:rPr>
+          <w:rFonts w:ascii="맑은 고딕" w:eastAsia="맑은 고딕" w:hAnsi="맑은 고딕"/>
+          <w:color w:val="000000"/>
+        </w:rPr>
+      </w:pPr>
+      <w:r>
+        <w:rPr>
+          <w:rFonts w:ascii="맑은 고딕" w:eastAsia="맑은 고딕" w:hAnsi="맑은 고딕" w:hint="eastAsia"/>
+          <w:color w:val="000000"/>
+        </w:rPr>
+        <w:t xml:space="preserve">이후 3.0 설치 STEP 1부터 Ubuntu 터미널에서 같은 명령으로 진행한다.</w:t>
+      </w:r>
+    </w:p>
+    <w:p>
+      <w:pPr>
+        <w:pStyle w:val="aa"/>
+        <w:ind w:leftChars="0"/>
+        <w:jc w:val="left"/>
+        <w:rPr>
+          <w:rFonts w:ascii="맑은 고딕" w:eastAsia="맑은 고딕" w:hAnsi="맑은 고딕"/>
+          <w:color w:val="000000"/>
+        </w:rPr>
+      </w:pPr>
+    </w:p>
+    <w:p>
+      <w:pPr>
+        <w:pStyle w:val="10"/>
+        <w:numPr>
+          <w:ilvl w:val="0"/>
+          <w:numId w:val="8"/>
+        </w:numPr>
+        <w:rPr>
+          <w:rFonts w:ascii="맑은 고딕" w:eastAsia="맑은 고딕" w:hAnsi="맑은 고딕"/>
+          <w:szCs w:val="28"/>
+        </w:rPr>
+      </w:pPr>
+      <w:r>
+        <w:rPr>
+          <w:rFonts w:ascii="맑은 고딕" w:eastAsia="맑은 고딕" w:hAnsi="맑은 고딕" w:hint="eastAsia"/>
+          <w:szCs w:val="28"/>
+        </w:rPr>
+        <w:t xml:space="preserve"> 설치 STEP 1 - 소스 코드 다운로드 및 Docker 이미지 생성</w:t>
+      </w:r>
+    </w:p>
+    <w:p>
+      <w:pPr>
+        <w:pStyle w:val="aa"/>
+        <w:keepNext/>
+        <w:numPr>
+          <w:ilvl w:val="0"/>
+          <w:numId w:val="104"/>
+        </w:numPr>
+        <w:ind w:leftChars="0"/>
+        <w:jc w:val="left"/>
+        <w:rPr>
+          <w:rFonts w:ascii="맑은 고딕" w:eastAsia="맑은 고딕" w:hAnsi="맑은 고딕"/>
+          <w:color w:val="000000"/>
+        </w:rPr>
+      </w:pPr>
+      <w:r>
+        <w:rPr>
+          <w:rFonts w:ascii="맑은 고딕" w:eastAsia="맑은 고딕" w:hAnsi="맑은 고딕" w:hint="eastAsia"/>
+          <w:color w:val="000000"/>
+        </w:rPr>
+        <w:t xml:space="preserve">소스 코드 다운로드</w:t>
+      </w:r>
+    </w:p>
+    <w:tbl>
+      <w:tblPr>
+        <w:tblStyle w:val="af"/>
+        <w:tblW w:w="0" w:type="auto"/>
+        <w:tblInd w:w="400" w:type="dxa"/>
+        <w:tblLook w:val="04A0" w:firstRow="1" w:lastRow="0" w:firstColumn="1" w:lastColumn="0" w:noHBand="0" w:noVBand="1"/>
+      </w:tblPr>
+      <w:tblGrid>
+        <w:gridCol w:w="8546"/>
+      </w:tblGrid>
+      <w:tr>
+        <w:trPr>
+          <w:cantSplit/>
+        </w:trPr>
+        <w:tc>
+          <w:tcPr>
+            <w:tcW w:w="8928" w:type="dxa"/>
+            <w:shd w:val="clear" w:color="auto" w:fill="F2F2F2" w:themeFill="background1" w:themeFillShade="F2"/>
+          </w:tcPr>
+          <w:p>
+            <w:pPr>
+              <w:pStyle w:val="aa"/>
+              <w:ind w:leftChars="0" w:left="0"/>
+              <w:jc w:val="left"/>
+              <w:rPr>
+                <w:rFonts w:ascii="맑은 고딕" w:eastAsia="맑은 고딕" w:hAnsi="맑은 고딕"/>
+                <w:color w:val="000000"/>
+              </w:rPr>
+            </w:pPr>
+            <w:r>
+              <w:rPr>
+                <w:rFonts w:ascii="맑은 고딕" w:eastAsia="맑은 고딕" w:hAnsi="맑은 고딕" w:hint="eastAsia"/>
+                <w:color w:val="000000"/>
+              </w:rPr>
+              <w:t xml:space="preserve">// 설치 위치로 이동 (e.g., $ cd ~) 후 아래 수행</w:t>
+            </w:r>
+          </w:p>
+          <w:p>
+            <w:pPr>
+              <w:pStyle w:val="12"/>
+              <w:jc w:val="left"/>
+            </w:pPr>
+            <w:r>
+              <w:t xml:space="preserve">$ git clone https://github.com/james4510/OutdoorRMP.git</w:t>
+            </w:r>
+          </w:p>
+          <w:p>
+            <w:pPr>
+              <w:pStyle w:val="12"/>
+              <w:jc w:val="left"/>
+            </w:pPr>
+            <w:r>
+              <w:t xml:space="preserve">$ cd OutdoorRMP</w:t>
+            </w:r>
+          </w:p>
+        </w:tc>
+      </w:tr>
+    </w:tbl>
+    <w:p>
+      <w:pPr>
+        <w:pStyle w:val="aa"/>
+        <w:ind w:leftChars="0"/>
+        <w:rPr>
+          <w:rFonts w:ascii="맑은 고딕" w:eastAsia="맑은 고딕" w:hAnsi="맑은 고딕"/>
+          <w:color w:val="000000"/>
+        </w:rPr>
+      </w:pPr>
+    </w:p>
+    <w:p>
+      <w:pPr>
+        <w:pStyle w:val="aa"/>
+        <w:keepNext/>
+        <w:numPr>
+          <w:ilvl w:val="0"/>
+          <w:numId w:val="12"/>
+        </w:numPr>
+        <w:ind w:leftChars="0"/>
+        <w:jc w:val="left"/>
+        <w:rPr>
+          <w:rFonts w:ascii="맑은 고딕" w:eastAsia="맑은 고딕" w:hAnsi="맑은 고딕"/>
+          <w:color w:val="000000"/>
+        </w:rPr>
+      </w:pPr>
+      <w:r>
+        <w:rPr>
+          <w:rFonts w:ascii="맑은 고딕" w:eastAsia="맑은 고딕" w:hAnsi="맑은 고딕" w:hint="eastAsia"/>
+          <w:color w:val="000000"/>
+        </w:rPr>
+        <w:t xml:space="preserve">위와 같이 할 경우 아래의 모습으로 directory가 생성됨</w:t>
+      </w:r>
+    </w:p>
+    <w:tbl>
+      <w:tblPr>
+        <w:tblStyle w:val="af"/>
+        <w:tblW w:w="0" w:type="auto"/>
+        <w:tblInd w:w="400" w:type="dxa"/>
+        <w:tblLook w:val="04A0" w:firstRow="1" w:lastRow="0" w:firstColumn="1" w:lastColumn="0" w:noHBand="0" w:noVBand="1"/>
+      </w:tblPr>
+      <w:tblGrid>
+        <w:gridCol w:w="8546"/>
+      </w:tblGrid>
+      <w:tr>
+        <w:trPr>
+          <w:cantSplit/>
+        </w:trPr>
+        <w:tc>
+          <w:tcPr>
+            <w:tcW w:w="8928" w:type="dxa"/>
+          </w:tcPr>
+          <w:p>
+            <w:pPr>
+              <w:wordWrap/>
+              <w:adjustRightInd w:val="0"/>
+              <w:spacing w:line="240" w:lineRule="exact"/>
+              <w:jc w:val="left"/>
+              <w:rPr>
+                <w:rFonts w:ascii="Courier New" w:eastAsiaTheme="minorHAnsi" w:hAnsi="Courier New" w:cs="Courier New"/>
+                <w:kern w:val="0"/>
+                <w:szCs w:val="20"/>
+              </w:rPr>
+            </w:pPr>
+            <w:r>
+              <w:rPr>
+                <w:rFonts w:ascii="Courier New" w:eastAsiaTheme="minorHAnsi" w:hAnsi="Courier New" w:cs="Courier New"/>
+                <w:kern w:val="0"/>
+                <w:szCs w:val="20"/>
+              </w:rPr>
+              <w:t xml:space="preserve">OutdoorRMP                 설치 root directory</w:t>
+            </w:r>
+          </w:p>
+          <w:p>
+            <w:pPr>
+              <w:wordWrap/>
+              <w:adjustRightInd w:val="0"/>
+              <w:spacing w:line="240" w:lineRule="exact"/>
+              <w:jc w:val="left"/>
+              <w:rPr>
+                <w:rFonts w:ascii="Courier New" w:eastAsiaTheme="minorHAnsi" w:hAnsi="Courier New" w:cs="Courier New"/>
+                <w:kern w:val="0"/>
+                <w:szCs w:val="20"/>
+              </w:rPr>
+            </w:pPr>
+            <w:r>
+              <w:rPr>
+                <w:rFonts w:ascii="Courier New" w:eastAsiaTheme="minorHAnsi" w:hAnsi="Courier New" w:cs="Courier New"/>
+                <w:kern w:val="0"/>
+                <w:szCs w:val="20"/>
+              </w:rPr>
+              <w:t xml:space="preserve">|-- Dockerfile             Docker 이미지 정의</w:t>
+            </w:r>
+          </w:p>
+          <w:p>
+            <w:pPr>
+              <w:wordWrap/>
+              <w:adjustRightInd w:val="0"/>
+              <w:spacing w:line="240" w:lineRule="exact"/>
+              <w:jc w:val="left"/>
+              <w:rPr>
+                <w:rFonts w:ascii="Courier New" w:eastAsiaTheme="minorHAnsi" w:hAnsi="Courier New" w:cs="Courier New"/>
+                <w:kern w:val="0"/>
+                <w:szCs w:val="20"/>
+              </w:rPr>
+            </w:pPr>
+            <w:r>
+              <w:rPr>
+                <w:rFonts w:ascii="Courier New" w:eastAsiaTheme="minorHAnsi" w:hAnsi="Courier New" w:cs="Courier New"/>
+                <w:kern w:val="0"/>
+                <w:szCs w:val="20"/>
+              </w:rPr>
+              <w:t xml:space="preserve">|-- docker-compose.yml     컨테이너 실행 설정 (GPU: rmp, CPU: rmp-cpu)</w:t>
+            </w:r>
+          </w:p>
+          <w:p>
+            <w:pPr>
+              <w:wordWrap/>
+              <w:adjustRightInd w:val="0"/>
+              <w:spacing w:line="240" w:lineRule="exact"/>
+              <w:jc w:val="left"/>
+              <w:rPr>
+                <w:rFonts w:ascii="Courier New" w:eastAsiaTheme="minorHAnsi" w:hAnsi="Courier New" w:cs="Courier New"/>
+                <w:kern w:val="0"/>
+                <w:szCs w:val="20"/>
+              </w:rPr>
+            </w:pPr>
+            <w:r>
+              <w:rPr>
+                <w:rFonts w:ascii="Courier New" w:eastAsiaTheme="minorHAnsi" w:hAnsi="Courier New" w:cs="Courier New"/>
+                <w:kern w:val="0"/>
+                <w:szCs w:val="20"/>
+              </w:rPr>
+              <w:t xml:space="preserve">|-- docker</w:t>
+            </w:r>
+          </w:p>
+          <w:p>
+            <w:pPr>
+              <w:wordWrap/>
+              <w:adjustRightInd w:val="0"/>
+              <w:spacing w:line="240" w:lineRule="exact"/>
+              <w:jc w:val="left"/>
+              <w:rPr>
+                <w:rFonts w:ascii="Courier New" w:eastAsiaTheme="minorHAnsi" w:hAnsi="Courier New" w:cs="Courier New"/>
+                <w:kern w:val="0"/>
+                <w:szCs w:val="20"/>
+              </w:rPr>
+            </w:pPr>
+            <w:r>
+              <w:rPr>
+                <w:rFonts w:ascii="Courier New" w:eastAsiaTheme="minorHAnsi" w:hAnsi="Courier New" w:cs="Courier New"/>
+                <w:kern w:val="0"/>
+                <w:szCs w:val="20"/>
+              </w:rPr>
+              <w:t xml:space="preserve">|   |-- requirements.txt   이미지에 추가로 설치되는 Python 패키지</w:t>
+            </w:r>
+          </w:p>
+          <w:p>
+            <w:pPr>
+              <w:wordWrap/>
+              <w:adjustRightInd w:val="0"/>
+              <w:spacing w:line="240" w:lineRule="exact"/>
+              <w:jc w:val="left"/>
+              <w:rPr>
+                <w:rFonts w:ascii="Courier New" w:eastAsiaTheme="minorHAnsi" w:hAnsi="Courier New" w:cs="Courier New"/>
+                <w:kern w:val="0"/>
+                <w:szCs w:val="20"/>
+              </w:rPr>
+            </w:pPr>
+            <w:r>
+              <w:rPr>
+                <w:rFonts w:ascii="Courier New" w:eastAsiaTheme="minorHAnsi" w:hAnsi="Courier New" w:cs="Courier New"/>
+                <w:kern w:val="0"/>
+                <w:szCs w:val="20"/>
+              </w:rPr>
+              <w:t xml:space="preserve">|   |-- setup_env.sh       실행 환경 설정 파일(.env) 생성</w:t>
+            </w:r>
+          </w:p>
+          <w:p>
+            <w:pPr>
+              <w:wordWrap/>
+              <w:adjustRightInd w:val="0"/>
+              <w:spacing w:line="240" w:lineRule="exact"/>
+              <w:jc w:val="left"/>
+              <w:rPr>
+                <w:rFonts w:ascii="Courier New" w:eastAsiaTheme="minorHAnsi" w:hAnsi="Courier New" w:cs="Courier New"/>
+                <w:kern w:val="0"/>
+                <w:szCs w:val="20"/>
+              </w:rPr>
+            </w:pPr>
+            <w:r>
+              <w:rPr>
+                <w:rFonts w:ascii="Courier New" w:eastAsiaTheme="minorHAnsi" w:hAnsi="Courier New" w:cs="Courier New"/>
+                <w:kern w:val="0"/>
+                <w:szCs w:val="20"/>
+              </w:rPr>
+              <w:t xml:space="preserve">|-- docs                   설치 매뉴얼</w:t>
+            </w:r>
+          </w:p>
+          <w:p>
+            <w:pPr>
+              <w:wordWrap/>
+              <w:adjustRightInd w:val="0"/>
+              <w:spacing w:line="240" w:lineRule="exact"/>
+              <w:jc w:val="left"/>
+              <w:rPr>
+                <w:rFonts w:ascii="Courier New" w:eastAsiaTheme="minorHAnsi" w:hAnsi="Courier New" w:cs="Courier New"/>
+                <w:kern w:val="0"/>
+                <w:szCs w:val="20"/>
+              </w:rPr>
+            </w:pPr>
+            <w:r>
+              <w:rPr>
+                <w:rFonts w:ascii="Courier New" w:eastAsiaTheme="minorHAnsi" w:hAnsi="Courier New" w:cs="Courier New"/>
+                <w:kern w:val="0"/>
+                <w:szCs w:val="20"/>
+              </w:rPr>
+              <w:t xml:space="preserve">|-- ikeee                  데이터셋, 모델, 학습 코드</w:t>
+            </w:r>
+          </w:p>
+          <w:p>
+            <w:pPr>
+              <w:wordWrap/>
+              <w:adjustRightInd w:val="0"/>
+              <w:spacing w:line="240" w:lineRule="exact"/>
+              <w:jc w:val="left"/>
+              <w:rPr>
+                <w:rFonts w:ascii="Courier New" w:eastAsiaTheme="minorHAnsi" w:hAnsi="Courier New" w:cs="Courier New"/>
+                <w:kern w:val="0"/>
+                <w:szCs w:val="20"/>
+              </w:rPr>
+            </w:pPr>
+            <w:r>
+              <w:rPr>
+                <w:rFonts w:ascii="Courier New" w:eastAsiaTheme="minorHAnsi" w:hAnsi="Courier New" w:cs="Courier New"/>
+                <w:kern w:val="0"/>
+                <w:szCs w:val="20"/>
+              </w:rPr>
+              <w:t xml:space="preserve">|-- scripts                평가, 그림 생성, 설치 확인(check_setup.py) 스크립트</w:t>
+            </w:r>
+          </w:p>
+          <w:p>
+            <w:pPr>
+              <w:wordWrap/>
+              <w:adjustRightInd w:val="0"/>
+              <w:spacing w:line="240" w:lineRule="exact"/>
+              <w:jc w:val="left"/>
+              <w:rPr>
+                <w:rFonts w:ascii="Courier New" w:eastAsiaTheme="minorHAnsi" w:hAnsi="Courier New" w:cs="Courier New"/>
+                <w:kern w:val="0"/>
+                <w:szCs w:val="20"/>
+              </w:rPr>
+            </w:pPr>
+            <w:r>
+              <w:rPr>
+                <w:rFonts w:ascii="Courier New" w:eastAsiaTheme="minorHAnsi" w:hAnsi="Courier New" w:cs="Courier New"/>
+                <w:kern w:val="0"/>
+                <w:szCs w:val="20"/>
+              </w:rPr>
+              <w:t xml:space="preserve">|-- results                논문 결과 (CSV, 그림)</w:t>
+            </w:r>
+          </w:p>
+          <w:p>
+            <w:pPr>
+              <w:wordWrap/>
+              <w:adjustRightInd w:val="0"/>
+              <w:spacing w:line="240" w:lineRule="exact"/>
+              <w:jc w:val="left"/>
+              <w:rPr>
+                <w:rFonts w:ascii="Courier New" w:eastAsiaTheme="minorHAnsi" w:hAnsi="Courier New" w:cs="Courier New"/>
+                <w:kern w:val="0"/>
+                <w:szCs w:val="20"/>
+              </w:rPr>
+            </w:pPr>
+            <w:r>
+              <w:rPr>
+                <w:rFonts w:ascii="Courier New" w:eastAsiaTheme="minorHAnsi" w:hAnsi="Courier New" w:cs="Courier New"/>
+                <w:kern w:val="0"/>
+                <w:szCs w:val="20"/>
+              </w:rPr>
+              <w:t xml:space="preserve">|-- README.md, README.ko.md</w:t>
+            </w:r>
+          </w:p>
+        </w:tc>
+      </w:tr>
+    </w:tbl>
+    <w:p>
+      <w:pPr>
+        <w:pStyle w:val="aa"/>
+        <w:ind w:leftChars="0"/>
+        <w:rPr>
+          <w:rFonts w:ascii="맑은 고딕" w:eastAsia="맑은 고딕" w:hAnsi="맑은 고딕"/>
+          <w:color w:val="000000"/>
+        </w:rPr>
+      </w:pPr>
+    </w:p>
+    <w:p>
+      <w:pPr>
+        <w:pStyle w:val="aa"/>
+        <w:keepNext/>
+        <w:numPr>
+          <w:ilvl w:val="0"/>
+          <w:numId w:val="104"/>
+        </w:numPr>
+        <w:ind w:leftChars="0"/>
+        <w:jc w:val="left"/>
+        <w:rPr>
+          <w:rFonts w:ascii="맑은 고딕" w:eastAsia="맑은 고딕" w:hAnsi="맑은 고딕"/>
+          <w:color w:val="000000"/>
+        </w:rPr>
+      </w:pPr>
+      <w:r>
+        <w:rPr>
+          <w:rFonts w:ascii="맑은 고딕" w:eastAsia="맑은 고딕" w:hAnsi="맑은 고딕" w:hint="eastAsia"/>
+          <w:color w:val="000000"/>
+        </w:rPr>
+        <w:t xml:space="preserve">Docker 이미지 생성</w:t>
+      </w:r>
+    </w:p>
+    <w:tbl>
+      <w:tblPr>
+        <w:tblStyle w:val="af"/>
+        <w:tblW w:w="0" w:type="auto"/>
+        <w:tblInd w:w="400" w:type="dxa"/>
+        <w:tblLook w:val="04A0" w:firstRow="1" w:lastRow="0" w:firstColumn="1" w:lastColumn="0" w:noHBand="0" w:noVBand="1"/>
+      </w:tblPr>
+      <w:tblGrid>
+        <w:gridCol w:w="8546"/>
+      </w:tblGrid>
+      <w:tr>
+        <w:trPr>
+          <w:cantSplit/>
+        </w:trPr>
+        <w:tc>
+          <w:tcPr>
+            <w:tcW w:w="8928" w:type="dxa"/>
+            <w:shd w:val="clear" w:color="auto" w:fill="F2F2F2" w:themeFill="background1" w:themeFillShade="F2"/>
+          </w:tcPr>
+          <w:p>
+            <w:pPr>
+              <w:pStyle w:val="aa"/>
+              <w:ind w:leftChars="0" w:left="0"/>
+              <w:jc w:val="left"/>
+              <w:rPr>
+                <w:rFonts w:ascii="맑은 고딕" w:eastAsia="맑은 고딕" w:hAnsi="맑은 고딕"/>
+                <w:color w:val="000000"/>
+              </w:rPr>
+            </w:pPr>
+            <w:r>
+              <w:rPr>
+                <w:rFonts w:ascii="맑은 고딕" w:eastAsia="맑은 고딕" w:hAnsi="맑은 고딕" w:hint="eastAsia"/>
+                <w:color w:val="000000"/>
+              </w:rPr>
+              <w:t xml:space="preserve">// OutdoorRMP directory에서 실행</w:t>
+            </w:r>
+          </w:p>
+          <w:p>
+            <w:pPr>
+              <w:pStyle w:val="aa"/>
+              <w:ind w:leftChars="0" w:left="0"/>
+              <w:jc w:val="left"/>
+              <w:rPr>
+                <w:rFonts w:ascii="맑은 고딕" w:eastAsia="맑은 고딕" w:hAnsi="맑은 고딕"/>
+                <w:color w:val="000000"/>
+              </w:rPr>
+            </w:pPr>
+            <w:r>
+              <w:rPr>
+                <w:rFonts w:ascii="맑은 고딕" w:eastAsia="맑은 고딕" w:hAnsi="맑은 고딕" w:hint="eastAsia"/>
+                <w:color w:val="000000"/>
+              </w:rPr>
+              <w:t xml:space="preserve">// 처음 실행 시 베이스 이미지(약 4 GB)를 다운로드하므로 시간이 소요됨</w:t>
+            </w:r>
+          </w:p>
+          <w:p>
+            <w:pPr>
+              <w:pStyle w:val="12"/>
+              <w:jc w:val="left"/>
+            </w:pPr>
+            <w:r>
+              <w:t xml:space="preserve">$ docker compose build</w:t>
+            </w:r>
+          </w:p>
+          <w:p>
+            <w:pPr>
+              <w:pStyle w:val="aa"/>
+              <w:ind w:leftChars="0" w:left="0"/>
+              <w:jc w:val="left"/>
+              <w:rPr>
+                <w:rFonts w:ascii="맑은 고딕" w:eastAsia="맑은 고딕" w:hAnsi="맑은 고딕"/>
+                <w:color w:val="000000"/>
+              </w:rPr>
+            </w:pPr>
+            <w:r>
+              <w:rPr>
+                <w:rFonts w:ascii="맑은 고딕" w:eastAsia="맑은 고딕" w:hAnsi="맑은 고딕" w:hint="eastAsia"/>
+                <w:color w:val="000000"/>
+              </w:rPr>
+              <w:t xml:space="preserve">// 생성된 이미지 확인 (REPOSITORY outdoor-rmp, TAG latest 이미지가 출력되면 성공)</w:t>
+            </w:r>
+          </w:p>
+          <w:p>
+            <w:pPr>
+              <w:pStyle w:val="12"/>
+              <w:jc w:val="left"/>
+            </w:pPr>
+            <w:r>
+              <w:t xml:space="preserve">$ docker images outdoor-rmp</w:t>
+            </w:r>
+          </w:p>
+        </w:tc>
+      </w:tr>
+    </w:tbl>
+    <w:p>
+      <w:pPr>
+        <w:pStyle w:val="aa"/>
+        <w:ind w:leftChars="0"/>
+        <w:rPr>
+          <w:rFonts w:ascii="맑은 고딕" w:eastAsia="맑은 고딕" w:hAnsi="맑은 고딕"/>
+          <w:color w:val="000000"/>
+        </w:rPr>
+      </w:pPr>
+    </w:p>
+    <w:p>
+      <w:pPr>
+        <w:pStyle w:val="10"/>
+        <w:numPr>
+          <w:ilvl w:val="0"/>
+          <w:numId w:val="8"/>
+        </w:numPr>
+        <w:rPr>
+          <w:rFonts w:ascii="맑은 고딕" w:eastAsia="맑은 고딕" w:hAnsi="맑은 고딕"/>
+          <w:szCs w:val="28"/>
+        </w:rPr>
+      </w:pPr>
+      <w:r>
+        <w:rPr>
+          <w:rFonts w:ascii="맑은 고딕" w:eastAsia="맑은 고딕" w:hAnsi="맑은 고딕" w:hint="eastAsia"/>
+          <w:szCs w:val="28"/>
+        </w:rPr>
+        <w:t xml:space="preserve"> 설치 STEP 2 - 데이터셋 및 체크포인트 배치</w:t>
+      </w:r>
+    </w:p>
+    <w:p>
+      <w:pPr>
+        <w:pStyle w:val="aa"/>
+        <w:keepNext/>
+        <w:numPr>
+          <w:ilvl w:val="0"/>
+          <w:numId w:val="105"/>
+        </w:numPr>
+        <w:ind w:leftChars="0"/>
+        <w:jc w:val="left"/>
+        <w:rPr>
+          <w:rFonts w:ascii="맑은 고딕" w:eastAsia="맑은 고딕" w:hAnsi="맑은 고딕"/>
+          <w:color w:val="000000"/>
+        </w:rPr>
+      </w:pPr>
+      <w:r>
+        <w:rPr>
+          <w:rFonts w:ascii="맑은 고딕" w:eastAsia="맑은 고딕" w:hAnsi="맑은 고딕" w:hint="eastAsia"/>
+          <w:color w:val="000000"/>
+        </w:rPr>
+        <w:t xml:space="preserve">데이터셋 배치</w:t>
+      </w:r>
+    </w:p>
+    <w:p>
+      <w:pPr>
+        <w:pStyle w:val="aa"/>
+        <w:keepNext/>
+        <w:numPr>
+          <w:ilvl w:val="0"/>
+          <w:numId w:val="6"/>
+        </w:numPr>
+        <w:ind w:leftChars="0"/>
+        <w:jc w:val="left"/>
+        <w:rPr>
+          <w:rFonts w:ascii="맑은 고딕" w:eastAsia="맑은 고딕" w:hAnsi="맑은 고딕"/>
+          <w:color w:val="000000"/>
+        </w:rPr>
+      </w:pPr>
+      <w:r>
+        <w:rPr>
+          <w:rFonts w:ascii="맑은 고딕" w:eastAsia="맑은 고딕" w:hAnsi="맑은 고딕" w:hint="eastAsia"/>
+          <w:color w:val="000000"/>
+        </w:rPr>
+        <w:t xml:space="preserve">데이터셋은 저장소에 포함되지 않으므로 별도로 전달받아 OutdoorRMP/data 에 둔다.</w:t>
+      </w:r>
+    </w:p>
+    <w:tbl>
+      <w:tblPr>
+        <w:tblStyle w:val="af"/>
+        <w:tblW w:w="0" w:type="auto"/>
+        <w:tblInd w:w="400" w:type="dxa"/>
+        <w:tblLook w:val="04A0" w:firstRow="1" w:lastRow="0" w:firstColumn="1" w:lastColumn="0" w:noHBand="0" w:noVBand="1"/>
+      </w:tblPr>
+      <w:tblGrid>
+        <w:gridCol w:w="8546"/>
+      </w:tblGrid>
+      <w:tr>
+        <w:trPr>
+          <w:cantSplit/>
+        </w:trPr>
+        <w:tc>
+          <w:tcPr>
+            <w:tcW w:w="8928" w:type="dxa"/>
+          </w:tcPr>
+          <w:p>
+            <w:pPr>
+              <w:wordWrap/>
+              <w:adjustRightInd w:val="0"/>
+              <w:spacing w:line="240" w:lineRule="exact"/>
+              <w:jc w:val="left"/>
+              <w:rPr>
+                <w:rFonts w:ascii="Courier New" w:eastAsiaTheme="minorHAnsi" w:hAnsi="Courier New" w:cs="Courier New"/>
+                <w:kern w:val="0"/>
+                <w:szCs w:val="20"/>
+              </w:rPr>
+            </w:pPr>
+            <w:r>
+              <w:rPr>
+                <w:rFonts w:ascii="Courier New" w:eastAsiaTheme="minorHAnsi" w:hAnsi="Courier New" w:cs="Courier New"/>
+                <w:kern w:val="0"/>
+                <w:szCs w:val="20"/>
+              </w:rPr>
+              <w:t xml:space="preserve">OutdoorRMP</w:t>
+            </w:r>
+          </w:p>
+          <w:p>
+            <w:pPr>
+              <w:wordWrap/>
+              <w:adjustRightInd w:val="0"/>
+              <w:spacing w:line="240" w:lineRule="exact"/>
+              <w:jc w:val="left"/>
+              <w:rPr>
+                <w:rFonts w:ascii="Courier New" w:eastAsiaTheme="minorHAnsi" w:hAnsi="Courier New" w:cs="Courier New"/>
+                <w:kern w:val="0"/>
+                <w:szCs w:val="20"/>
+              </w:rPr>
+            </w:pPr>
+            <w:r>
+              <w:rPr>
+                <w:rFonts w:ascii="Courier New" w:eastAsiaTheme="minorHAnsi" w:hAnsi="Courier New" w:cs="Courier New"/>
+                <w:kern w:val="0"/>
+                <w:szCs w:val="20"/>
+              </w:rPr>
+              <w:t xml:space="preserve">|-- data</w:t>
+            </w:r>
+          </w:p>
+          <w:p>
+            <w:pPr>
+              <w:wordWrap/>
+              <w:adjustRightInd w:val="0"/>
+              <w:spacing w:line="240" w:lineRule="exact"/>
+              <w:jc w:val="left"/>
+              <w:rPr>
+                <w:rFonts w:ascii="Courier New" w:eastAsiaTheme="minorHAnsi" w:hAnsi="Courier New" w:cs="Courier New"/>
+                <w:kern w:val="0"/>
+                <w:szCs w:val="20"/>
+              </w:rPr>
+            </w:pPr>
+            <w:r>
+              <w:rPr>
+                <w:rFonts w:ascii="Courier New" w:eastAsiaTheme="minorHAnsi" w:hAnsi="Courier New" w:cs="Courier New"/>
+                <w:kern w:val="0"/>
+                <w:szCs w:val="20"/>
+              </w:rPr>
+              <w:t xml:space="preserve">|   |-- stations_position.txt           샘플별 송신기 3개 위치 (2000줄)</w:t>
+            </w:r>
+          </w:p>
+          <w:p>
+            <w:pPr>
+              <w:wordWrap/>
+              <w:adjustRightInd w:val="0"/>
+              <w:spacing w:line="240" w:lineRule="exact"/>
+              <w:jc w:val="left"/>
+              <w:rPr>
+                <w:rFonts w:ascii="Courier New" w:eastAsiaTheme="minorHAnsi" w:hAnsi="Courier New" w:cs="Courier New"/>
+                <w:kern w:val="0"/>
+                <w:szCs w:val="20"/>
+              </w:rPr>
+            </w:pPr>
+            <w:r>
+              <w:rPr>
+                <w:rFonts w:ascii="Courier New" w:eastAsiaTheme="minorHAnsi" w:hAnsi="Courier New" w:cs="Courier New"/>
+                <w:kern w:val="0"/>
+                <w:szCs w:val="20"/>
+              </w:rPr>
+              <w:t xml:space="preserve">|   |-- buildings_position</w:t>
+            </w:r>
+          </w:p>
+          <w:p>
+            <w:pPr>
+              <w:wordWrap/>
+              <w:adjustRightInd w:val="0"/>
+              <w:spacing w:line="240" w:lineRule="exact"/>
+              <w:jc w:val="left"/>
+              <w:rPr>
+                <w:rFonts w:ascii="Courier New" w:eastAsiaTheme="minorHAnsi" w:hAnsi="Courier New" w:cs="Courier New"/>
+                <w:kern w:val="0"/>
+                <w:szCs w:val="20"/>
+              </w:rPr>
+            </w:pPr>
+            <w:r>
+              <w:rPr>
+                <w:rFonts w:ascii="Courier New" w:eastAsiaTheme="minorHAnsi" w:hAnsi="Courier New" w:cs="Courier New"/>
+                <w:kern w:val="0"/>
+                <w:szCs w:val="20"/>
+              </w:rPr>
+              <w:t xml:space="preserve">|   |   |-- buildings_{n}.mat           건물 배치 (n = 1 ~ 2000)</w:t>
+            </w:r>
+          </w:p>
+          <w:p>
+            <w:pPr>
+              <w:wordWrap/>
+              <w:adjustRightInd w:val="0"/>
+              <w:spacing w:line="240" w:lineRule="exact"/>
+              <w:jc w:val="left"/>
+              <w:rPr>
+                <w:rFonts w:ascii="Courier New" w:eastAsiaTheme="minorHAnsi" w:hAnsi="Courier New" w:cs="Courier New"/>
+                <w:kern w:val="0"/>
+                <w:szCs w:val="20"/>
+              </w:rPr>
+            </w:pPr>
+            <w:r>
+              <w:rPr>
+                <w:rFonts w:ascii="Courier New" w:eastAsiaTheme="minorHAnsi" w:hAnsi="Courier New" w:cs="Courier New"/>
+                <w:kern w:val="0"/>
+                <w:szCs w:val="20"/>
+              </w:rPr>
+              <w:t xml:space="preserve">|   |-- receivedpower_1750MHz_mat</w:t>
+            </w:r>
+          </w:p>
+          <w:p>
+            <w:pPr>
+              <w:wordWrap/>
+              <w:adjustRightInd w:val="0"/>
+              <w:spacing w:line="240" w:lineRule="exact"/>
+              <w:jc w:val="left"/>
+              <w:rPr>
+                <w:rFonts w:ascii="Courier New" w:eastAsiaTheme="minorHAnsi" w:hAnsi="Courier New" w:cs="Courier New"/>
+                <w:kern w:val="0"/>
+                <w:szCs w:val="20"/>
+              </w:rPr>
+            </w:pPr>
+            <w:r>
+              <w:rPr>
+                <w:rFonts w:ascii="Courier New" w:eastAsiaTheme="minorHAnsi" w:hAnsi="Courier New" w:cs="Courier New"/>
+                <w:kern w:val="0"/>
+                <w:szCs w:val="20"/>
+              </w:rPr>
+              <w:t xml:space="preserve">|   |   |-- TOTAL_REC_1750MHz_{n}.mat   수신 전력 맵</w:t>
+            </w:r>
+          </w:p>
+          <w:p>
+            <w:pPr>
+              <w:wordWrap/>
+              <w:adjustRightInd w:val="0"/>
+              <w:spacing w:line="240" w:lineRule="exact"/>
+              <w:jc w:val="left"/>
+              <w:rPr>
+                <w:rFonts w:ascii="Courier New" w:eastAsiaTheme="minorHAnsi" w:hAnsi="Courier New" w:cs="Courier New"/>
+                <w:kern w:val="0"/>
+                <w:szCs w:val="20"/>
+              </w:rPr>
+            </w:pPr>
+            <w:r>
+              <w:rPr>
+                <w:rFonts w:ascii="Courier New" w:eastAsiaTheme="minorHAnsi" w:hAnsi="Courier New" w:cs="Courier New"/>
+                <w:kern w:val="0"/>
+                <w:szCs w:val="20"/>
+              </w:rPr>
+              <w:t xml:space="preserve">|   |-- receivedpower_2750MHz_mat</w:t>
+            </w:r>
+          </w:p>
+          <w:p>
+            <w:pPr>
+              <w:wordWrap/>
+              <w:adjustRightInd w:val="0"/>
+              <w:spacing w:line="240" w:lineRule="exact"/>
+              <w:jc w:val="left"/>
+              <w:rPr>
+                <w:rFonts w:ascii="Courier New" w:eastAsiaTheme="minorHAnsi" w:hAnsi="Courier New" w:cs="Courier New"/>
+                <w:kern w:val="0"/>
+                <w:szCs w:val="20"/>
+              </w:rPr>
+            </w:pPr>
+            <w:r>
+              <w:rPr>
+                <w:rFonts w:ascii="Courier New" w:eastAsiaTheme="minorHAnsi" w:hAnsi="Courier New" w:cs="Courier New"/>
+                <w:kern w:val="0"/>
+                <w:szCs w:val="20"/>
+              </w:rPr>
+              <w:t xml:space="preserve">|   |-- receivedpower_3750MHz_mat</w:t>
+            </w:r>
+          </w:p>
+          <w:p>
+            <w:pPr>
+              <w:wordWrap/>
+              <w:adjustRightInd w:val="0"/>
+              <w:spacing w:line="240" w:lineRule="exact"/>
+              <w:jc w:val="left"/>
+              <w:rPr>
+                <w:rFonts w:ascii="Courier New" w:eastAsiaTheme="minorHAnsi" w:hAnsi="Courier New" w:cs="Courier New"/>
+                <w:kern w:val="0"/>
+                <w:szCs w:val="20"/>
+              </w:rPr>
+            </w:pPr>
+            <w:r>
+              <w:rPr>
+                <w:rFonts w:ascii="Courier New" w:eastAsiaTheme="minorHAnsi" w:hAnsi="Courier New" w:cs="Courier New"/>
+                <w:kern w:val="0"/>
+                <w:szCs w:val="20"/>
+              </w:rPr>
+              <w:t xml:space="preserve">|   |-- receivedpower_4750MHz_mat</w:t>
+            </w:r>
+          </w:p>
+          <w:p>
+            <w:pPr>
+              <w:wordWrap/>
+              <w:adjustRightInd w:val="0"/>
+              <w:spacing w:line="240" w:lineRule="exact"/>
+              <w:jc w:val="left"/>
+              <w:rPr>
+                <w:rFonts w:ascii="Courier New" w:eastAsiaTheme="minorHAnsi" w:hAnsi="Courier New" w:cs="Courier New"/>
+                <w:kern w:val="0"/>
+                <w:szCs w:val="20"/>
+              </w:rPr>
+            </w:pPr>
+            <w:r>
+              <w:rPr>
+                <w:rFonts w:ascii="Courier New" w:eastAsiaTheme="minorHAnsi" w:hAnsi="Courier New" w:cs="Courier New"/>
+                <w:kern w:val="0"/>
+                <w:szCs w:val="20"/>
+              </w:rPr>
+              <w:t xml:space="preserve">|   |-- receivedpower_5750MHz_mat</w:t>
+            </w:r>
+          </w:p>
+        </w:tc>
+      </w:tr>
+    </w:tbl>
+    <w:p>
+      <w:pPr>
+        <w:pStyle w:val="aa"/>
+        <w:keepNext/>
+        <w:numPr>
+          <w:ilvl w:val="0"/>
+          <w:numId w:val="12"/>
+        </w:numPr>
+        <w:ind w:leftChars="0"/>
+        <w:jc w:val="left"/>
+        <w:rPr>
+          <w:rFonts w:ascii="맑은 고딕" w:eastAsia="맑은 고딕" w:hAnsi="맑은 고딕"/>
+          <w:color w:val="000000"/>
+        </w:rPr>
+      </w:pPr>
+      <w:r>
+        <w:rPr>
+          <w:rFonts w:ascii="맑은 고딕" w:eastAsia="맑은 고딕" w:hAnsi="맑은 고딕" w:hint="eastAsia"/>
+          <w:color w:val="000000"/>
+        </w:rPr>
+        <w:t xml:space="preserve">다른 위치에 있는 데이터셋은 3)에서 경로를 지정한다.</w:t>
+      </w:r>
+    </w:p>
+    <w:p>
+      <w:pPr>
+        <w:pStyle w:val="aa"/>
+        <w:ind w:leftChars="0"/>
+        <w:rPr>
+          <w:rFonts w:ascii="맑은 고딕" w:eastAsia="맑은 고딕" w:hAnsi="맑은 고딕"/>
+          <w:color w:val="000000"/>
+        </w:rPr>
+      </w:pPr>
+    </w:p>
+    <w:p>
+      <w:pPr>
+        <w:pStyle w:val="aa"/>
+        <w:keepNext/>
+        <w:numPr>
+          <w:ilvl w:val="0"/>
+          <w:numId w:val="105"/>
+        </w:numPr>
+        <w:ind w:leftChars="0"/>
+        <w:jc w:val="left"/>
+        <w:rPr>
+          <w:rFonts w:ascii="맑은 고딕" w:eastAsia="맑은 고딕" w:hAnsi="맑은 고딕"/>
+          <w:color w:val="000000"/>
+        </w:rPr>
+      </w:pPr>
+      <w:r>
+        <w:rPr>
+          <w:rFonts w:ascii="맑은 고딕" w:eastAsia="맑은 고딕" w:hAnsi="맑은 고딕" w:hint="eastAsia"/>
+          <w:color w:val="000000"/>
+        </w:rPr>
+        <w:t xml:space="preserve">체크포인트 배치 (평가 시 필요, 학습만 할 경우 생략)</w:t>
+      </w:r>
+    </w:p>
+    <w:tbl>
+      <w:tblPr>
+        <w:tblStyle w:val="af"/>
+        <w:tblW w:w="0" w:type="auto"/>
+        <w:tblInd w:w="400" w:type="dxa"/>
+        <w:tblLook w:val="04A0" w:firstRow="1" w:lastRow="0" w:firstColumn="1" w:lastColumn="0" w:noHBand="0" w:noVBand="1"/>
+      </w:tblPr>
+      <w:tblGrid>
+        <w:gridCol w:w="8546"/>
+      </w:tblGrid>
+      <w:tr>
+        <w:trPr>
+          <w:cantSplit/>
+        </w:trPr>
+        <w:tc>
+          <w:tcPr>
+            <w:tcW w:w="8928" w:type="dxa"/>
+          </w:tcPr>
+          <w:p>
+            <w:pPr>
+              <w:wordWrap/>
+              <w:adjustRightInd w:val="0"/>
+              <w:spacing w:line="240" w:lineRule="exact"/>
+              <w:jc w:val="left"/>
+              <w:rPr>
+                <w:rFonts w:ascii="Courier New" w:eastAsiaTheme="minorHAnsi" w:hAnsi="Courier New" w:cs="Courier New"/>
+                <w:kern w:val="0"/>
+                <w:szCs w:val="20"/>
+              </w:rPr>
+            </w:pPr>
+            <w:r>
+              <w:rPr>
+                <w:rFonts w:ascii="Courier New" w:eastAsiaTheme="minorHAnsi" w:hAnsi="Courier New" w:cs="Courier New"/>
+                <w:kern w:val="0"/>
+                <w:szCs w:val="20"/>
+              </w:rPr>
+              <w:t xml:space="preserve">OutdoorRMP</w:t>
+            </w:r>
+          </w:p>
+          <w:p>
+            <w:pPr>
+              <w:wordWrap/>
+              <w:adjustRightInd w:val="0"/>
+              <w:spacing w:line="240" w:lineRule="exact"/>
+              <w:jc w:val="left"/>
+              <w:rPr>
+                <w:rFonts w:ascii="Courier New" w:eastAsiaTheme="minorHAnsi" w:hAnsi="Courier New" w:cs="Courier New"/>
+                <w:kern w:val="0"/>
+                <w:szCs w:val="20"/>
+              </w:rPr>
+            </w:pPr>
+            <w:r>
+              <w:rPr>
+                <w:rFonts w:ascii="Courier New" w:eastAsiaTheme="minorHAnsi" w:hAnsi="Courier New" w:cs="Courier New"/>
+                <w:kern w:val="0"/>
+                <w:szCs w:val="20"/>
+              </w:rPr>
+              <w:t xml:space="preserve">|-- model_checkpoints</w:t>
+            </w:r>
+          </w:p>
+          <w:p>
+            <w:pPr>
+              <w:wordWrap/>
+              <w:adjustRightInd w:val="0"/>
+              <w:spacing w:line="240" w:lineRule="exact"/>
+              <w:jc w:val="left"/>
+              <w:rPr>
+                <w:rFonts w:ascii="Courier New" w:eastAsiaTheme="minorHAnsi" w:hAnsi="Courier New" w:cs="Courier New"/>
+                <w:kern w:val="0"/>
+                <w:szCs w:val="20"/>
+              </w:rPr>
+            </w:pPr>
+            <w:r>
+              <w:rPr>
+                <w:rFonts w:ascii="Courier New" w:eastAsiaTheme="minorHAnsi" w:hAnsi="Courier New" w:cs="Courier New"/>
+                <w:kern w:val="0"/>
+                <w:szCs w:val="20"/>
+              </w:rPr>
+              <w:t xml:space="preserve">|   |-- checkpoints_radiounet_small_{freq}/best.pth</w:t>
+            </w:r>
+          </w:p>
+          <w:p>
+            <w:pPr>
+              <w:wordWrap/>
+              <w:adjustRightInd w:val="0"/>
+              <w:spacing w:line="240" w:lineRule="exact"/>
+              <w:jc w:val="left"/>
+              <w:rPr>
+                <w:rFonts w:ascii="Courier New" w:eastAsiaTheme="minorHAnsi" w:hAnsi="Courier New" w:cs="Courier New"/>
+                <w:kern w:val="0"/>
+                <w:szCs w:val="20"/>
+              </w:rPr>
+            </w:pPr>
+            <w:r>
+              <w:rPr>
+                <w:rFonts w:ascii="Courier New" w:eastAsiaTheme="minorHAnsi" w:hAnsi="Courier New" w:cs="Courier New"/>
+                <w:kern w:val="0"/>
+                <w:szCs w:val="20"/>
+              </w:rPr>
+              <w:t xml:space="preserve">|   |-- checkpoints_radiounet_medium_{freq}/best.pth</w:t>
+            </w:r>
+          </w:p>
+          <w:p>
+            <w:pPr>
+              <w:wordWrap/>
+              <w:adjustRightInd w:val="0"/>
+              <w:spacing w:line="240" w:lineRule="exact"/>
+              <w:jc w:val="left"/>
+              <w:rPr>
+                <w:rFonts w:ascii="Courier New" w:eastAsiaTheme="minorHAnsi" w:hAnsi="Courier New" w:cs="Courier New"/>
+                <w:kern w:val="0"/>
+                <w:szCs w:val="20"/>
+              </w:rPr>
+            </w:pPr>
+            <w:r>
+              <w:rPr>
+                <w:rFonts w:ascii="Courier New" w:eastAsiaTheme="minorHAnsi" w:hAnsi="Courier New" w:cs="Courier New"/>
+                <w:kern w:val="0"/>
+                <w:szCs w:val="20"/>
+              </w:rPr>
+              <w:t xml:space="preserve">|   |-- checkpoints_transpathnet_small_{freq}/best.pth</w:t>
+            </w:r>
+          </w:p>
+          <w:p>
+            <w:pPr>
+              <w:wordWrap/>
+              <w:adjustRightInd w:val="0"/>
+              <w:spacing w:line="240" w:lineRule="exact"/>
+              <w:jc w:val="left"/>
+              <w:rPr>
+                <w:rFonts w:ascii="Courier New" w:eastAsiaTheme="minorHAnsi" w:hAnsi="Courier New" w:cs="Courier New"/>
+                <w:kern w:val="0"/>
+                <w:szCs w:val="20"/>
+              </w:rPr>
+            </w:pPr>
+            <w:r>
+              <w:rPr>
+                <w:rFonts w:ascii="Courier New" w:eastAsiaTheme="minorHAnsi" w:hAnsi="Courier New" w:cs="Courier New"/>
+                <w:kern w:val="0"/>
+                <w:szCs w:val="20"/>
+              </w:rPr>
+              <w:t xml:space="preserve">|   |-- checkpoints_transpathnet_base_{freq}/best.pth</w:t>
+            </w:r>
+          </w:p>
+          <w:p>
+            <w:pPr>
+              <w:wordWrap/>
+              <w:adjustRightInd w:val="0"/>
+              <w:spacing w:line="240" w:lineRule="exact"/>
+              <w:jc w:val="left"/>
+              <w:rPr>
+                <w:rFonts w:ascii="Courier New" w:eastAsiaTheme="minorHAnsi" w:hAnsi="Courier New" w:cs="Courier New"/>
+                <w:kern w:val="0"/>
+                <w:szCs w:val="20"/>
+              </w:rPr>
+            </w:pPr>
+            <w:r>
+              <w:rPr>
+                <w:rFonts w:ascii="Courier New" w:eastAsiaTheme="minorHAnsi" w:hAnsi="Courier New" w:cs="Courier New"/>
+                <w:kern w:val="0"/>
+                <w:szCs w:val="20"/>
+              </w:rPr>
+              <w:t xml:space="preserve">|   |-- checkpoints_radiounet_small_4750_v2/best.pth</w:t>
+            </w:r>
+          </w:p>
+          <w:p>
+            <w:pPr>
+              <w:wordWrap/>
+              <w:adjustRightInd w:val="0"/>
+              <w:spacing w:line="240" w:lineRule="exact"/>
+              <w:jc w:val="left"/>
+              <w:rPr>
+                <w:rFonts w:ascii="Courier New" w:eastAsiaTheme="minorHAnsi" w:hAnsi="Courier New" w:cs="Courier New"/>
+                <w:kern w:val="0"/>
+                <w:szCs w:val="20"/>
+              </w:rPr>
+            </w:pPr>
+            <w:r>
+              <w:rPr>
+                <w:rFonts w:ascii="Courier New" w:eastAsiaTheme="minorHAnsi" w:hAnsi="Courier New" w:cs="Courier New"/>
+                <w:kern w:val="0"/>
+                <w:szCs w:val="20"/>
+              </w:rPr>
+              <w:t xml:space="preserve"/>
+            </w:r>
+          </w:p>
+          <w:p>
+            <w:pPr>
+              <w:wordWrap/>
+              <w:adjustRightInd w:val="0"/>
+              <w:spacing w:line="240" w:lineRule="exact"/>
+              <w:jc w:val="left"/>
+              <w:rPr>
+                <w:rFonts w:ascii="Courier New" w:eastAsiaTheme="minorHAnsi" w:hAnsi="Courier New" w:cs="Courier New"/>
+                <w:kern w:val="0"/>
+                <w:szCs w:val="20"/>
+              </w:rPr>
+            </w:pPr>
+            <w:r>
+              <w:rPr>
+                <w:rFonts w:ascii="Courier New" w:eastAsiaTheme="minorHAnsi" w:hAnsi="Courier New" w:cs="Courier New"/>
+                <w:kern w:val="0"/>
+                <w:szCs w:val="20"/>
+              </w:rPr>
+              <w:t xml:space="preserve">{freq}: 1750, 2750, 3750, 4750, 5750</w:t>
+            </w:r>
+          </w:p>
+          <w:p>
+            <w:pPr>
+              <w:wordWrap/>
+              <w:adjustRightInd w:val="0"/>
+              <w:spacing w:line="240" w:lineRule="exact"/>
+              <w:jc w:val="left"/>
+              <w:rPr>
+                <w:rFonts w:ascii="Courier New" w:eastAsiaTheme="minorHAnsi" w:hAnsi="Courier New" w:cs="Courier New"/>
+                <w:kern w:val="0"/>
+                <w:szCs w:val="20"/>
+              </w:rPr>
+            </w:pPr>
+            <w:r>
+              <w:rPr>
+                <w:rFonts w:ascii="Courier New" w:eastAsiaTheme="minorHAnsi" w:hAnsi="Courier New" w:cs="Courier New"/>
+                <w:kern w:val="0"/>
+                <w:szCs w:val="20"/>
+              </w:rPr>
+              <w:t xml:space="preserve">_v2: 있으면 4750 MHz RadioUNet-S 평가에 사용</w:t>
+            </w:r>
+          </w:p>
+        </w:tc>
+      </w:tr>
+    </w:tbl>
+    <w:p>
+      <w:pPr>
+        <w:pStyle w:val="aa"/>
+        <w:ind w:leftChars="0"/>
+        <w:rPr>
+          <w:rFonts w:ascii="맑은 고딕" w:eastAsia="맑은 고딕" w:hAnsi="맑은 고딕"/>
+          <w:color w:val="000000"/>
+        </w:rPr>
+      </w:pPr>
+    </w:p>
+    <w:p>
+      <w:pPr>
+        <w:pStyle w:val="aa"/>
+        <w:keepNext/>
+        <w:numPr>
+          <w:ilvl w:val="0"/>
+          <w:numId w:val="105"/>
+        </w:numPr>
+        <w:ind w:leftChars="0"/>
+        <w:jc w:val="left"/>
+        <w:rPr>
+          <w:rFonts w:ascii="맑은 고딕" w:eastAsia="맑은 고딕" w:hAnsi="맑은 고딕"/>
+          <w:color w:val="000000"/>
+        </w:rPr>
+      </w:pPr>
+      <w:r>
+        <w:rPr>
+          <w:rFonts w:ascii="맑은 고딕" w:eastAsia="맑은 고딕" w:hAnsi="맑은 고딕" w:hint="eastAsia"/>
+          <w:color w:val="000000"/>
+        </w:rPr>
+        <w:t xml:space="preserve">실행 환경 설정 파일(.env) 생성</w:t>
+      </w:r>
+    </w:p>
+    <w:tbl>
+      <w:tblPr>
+        <w:tblStyle w:val="af"/>
+        <w:tblW w:w="0" w:type="auto"/>
+        <w:tblInd w:w="400" w:type="dxa"/>
+        <w:tblLook w:val="04A0" w:firstRow="1" w:lastRow="0" w:firstColumn="1" w:lastColumn="0" w:noHBand="0" w:noVBand="1"/>
+      </w:tblPr>
+      <w:tblGrid>
+        <w:gridCol w:w="8546"/>
+      </w:tblGrid>
+      <w:tr>
+        <w:trPr>
+          <w:cantSplit/>
+        </w:trPr>
+        <w:tc>
+          <w:tcPr>
+            <w:tcW w:w="8928" w:type="dxa"/>
+            <w:shd w:val="clear" w:color="auto" w:fill="F2F2F2" w:themeFill="background1" w:themeFillShade="F2"/>
+          </w:tcPr>
+          <w:p>
+            <w:pPr>
+              <w:pStyle w:val="aa"/>
+              <w:ind w:leftChars="0" w:left="0"/>
+              <w:jc w:val="left"/>
+              <w:rPr>
+                <w:rFonts w:ascii="맑은 고딕" w:eastAsia="맑은 고딕" w:hAnsi="맑은 고딕"/>
+                <w:color w:val="000000"/>
+              </w:rPr>
+            </w:pPr>
+            <w:r>
+              <w:rPr>
+                <w:rFonts w:ascii="맑은 고딕" w:eastAsia="맑은 고딕" w:hAnsi="맑은 고딕" w:hint="eastAsia"/>
+                <w:color w:val="000000"/>
+              </w:rPr>
+              <w:t xml:space="preserve">// 데이터셋과 체크포인트가 OutdoorRMP 안에 있는 경우</w:t>
+            </w:r>
+          </w:p>
+          <w:p>
+            <w:pPr>
+              <w:pStyle w:val="12"/>
+              <w:jc w:val="left"/>
+            </w:pPr>
+            <w:r>
+              <w:t xml:space="preserve">$ bash docker/setup_env.sh</w:t>
+            </w:r>
+          </w:p>
+          <w:p>
+            <w:pPr>
+              <w:pStyle w:val="aa"/>
+              <w:ind w:leftChars="0" w:left="0"/>
+              <w:jc w:val="left"/>
+              <w:rPr>
+                <w:rFonts w:ascii="맑은 고딕" w:eastAsia="맑은 고딕" w:hAnsi="맑은 고딕"/>
+                <w:color w:val="000000"/>
+              </w:rPr>
+            </w:pPr>
+            <w:r>
+              <w:rPr>
+                <w:rFonts w:ascii="맑은 고딕" w:eastAsia="맑은 고딕" w:hAnsi="맑은 고딕" w:hint="eastAsia"/>
+                <w:color w:val="000000"/>
+              </w:rPr>
+              <w:t xml:space="preserve">// 다른 위치에 있는 경우 경로 지정</w:t>
+            </w:r>
+          </w:p>
+          <w:p>
+            <w:pPr>
+              <w:pStyle w:val="12"/>
+              <w:jc w:val="left"/>
+            </w:pPr>
+            <w:r>
+              <w:t xml:space="preserve">$ bash docker/setup_env.sh /path/to/data /path/to/model_checkpoints</w:t>
+            </w:r>
+          </w:p>
+          <w:p>
+            <w:pPr>
+              <w:pStyle w:val="aa"/>
+              <w:ind w:leftChars="0" w:left="0"/>
+              <w:jc w:val="left"/>
+              <w:rPr>
+                <w:rFonts w:ascii="맑은 고딕" w:eastAsia="맑은 고딕" w:hAnsi="맑은 고딕"/>
+                <w:color w:val="000000"/>
+              </w:rPr>
+            </w:pPr>
+            <w:r>
+              <w:rPr>
+                <w:rFonts w:ascii="맑은 고딕" w:eastAsia="맑은 고딕" w:hAnsi="맑은 고딕" w:hint="eastAsia"/>
+                <w:color w:val="000000"/>
+              </w:rPr>
+              <w:t xml:space="preserve">// 생성 결과 예시</w:t>
             </w:r>
           </w:p>
           <w:p>
@@ -2576,7 +3019,7 @@
                 <w:sz w:val="20"/>
                 <w:szCs w:val="20"/>
               </w:rPr>
-              <w:t xml:space="preserve">[1/5] Python packages</w:t>
+              <w:t xml:space="preserve">Created /home/user/OutdoorRMP/.env</w:t>
             </w:r>
           </w:p>
           <w:p>
@@ -2607,7 +3050,7 @@
                 <w:sz w:val="20"/>
                 <w:szCs w:val="20"/>
               </w:rPr>
-              <w:t xml:space="preserve">  OK       torch ...</w:t>
+              <w:t xml:space="preserve">HOST_UID=1000</w:t>
             </w:r>
           </w:p>
           <w:p>
@@ -2638,7 +3081,7 @@
                 <w:sz w:val="20"/>
                 <w:szCs w:val="20"/>
               </w:rPr>
-              <w:t xml:space="preserve">...</w:t>
+              <w:t xml:space="preserve">HOST_GID=1000</w:t>
             </w:r>
           </w:p>
           <w:p>
@@ -2669,7 +3112,7 @@
                 <w:sz w:val="20"/>
                 <w:szCs w:val="20"/>
               </w:rPr>
-              <w:t xml:space="preserve">[2/5] GPU</w:t>
+              <w:t xml:space="preserve">DATA_DIR=/home/user/OutdoorRMP/data</w:t>
             </w:r>
           </w:p>
           <w:p>
@@ -2700,7 +3143,89 @@
                 <w:sz w:val="20"/>
                 <w:szCs w:val="20"/>
               </w:rPr>
-              <w:t xml:space="preserve">  OK       cuda:0  NVIDIA GeForce RTX 2080 Ti</w:t>
+              <w:t xml:space="preserve">CKPT_DIR=/home/user/OutdoorRMP/model_checkpoints</w:t>
+            </w:r>
+          </w:p>
+        </w:tc>
+      </w:tr>
+    </w:tbl>
+    <w:p>
+      <w:pPr>
+        <w:pStyle w:val="aa"/>
+        <w:ind w:leftChars="0"/>
+        <w:jc w:val="left"/>
+        <w:rPr>
+          <w:rFonts w:ascii="맑은 고딕" w:eastAsia="맑은 고딕" w:hAnsi="맑은 고딕"/>
+          <w:color w:val="000000"/>
+        </w:rPr>
+      </w:pPr>
+      <w:r>
+        <w:rPr>
+          <w:rFonts w:ascii="맑은 고딕" w:eastAsia="맑은 고딕" w:hAnsi="맑은 고딕" w:hint="eastAsia"/>
+          <w:color w:val="000000"/>
+        </w:rPr>
+        <w:t xml:space="preserve">※ HOST_UID, HOST_GID는 컨테이너가 만든 결과 파일의 소유자를 현재 사용자로 맞추는 값이다.</w:t>
+      </w:r>
+    </w:p>
+    <w:p>
+      <w:pPr>
+        <w:pStyle w:val="aa"/>
+        <w:ind w:leftChars="0"/>
+        <w:rPr>
+          <w:rFonts w:ascii="맑은 고딕" w:eastAsia="맑은 고딕" w:hAnsi="맑은 고딕"/>
+          <w:color w:val="000000"/>
+        </w:rPr>
+      </w:pPr>
+    </w:p>
+    <w:p>
+      <w:pPr>
+        <w:pStyle w:val="aa"/>
+        <w:keepNext/>
+        <w:numPr>
+          <w:ilvl w:val="0"/>
+          <w:numId w:val="105"/>
+        </w:numPr>
+        <w:ind w:leftChars="0"/>
+        <w:jc w:val="left"/>
+        <w:rPr>
+          <w:rFonts w:ascii="맑은 고딕" w:eastAsia="맑은 고딕" w:hAnsi="맑은 고딕"/>
+          <w:color w:val="000000"/>
+        </w:rPr>
+      </w:pPr>
+      <w:r>
+        <w:rPr>
+          <w:rFonts w:ascii="맑은 고딕" w:eastAsia="맑은 고딕" w:hAnsi="맑은 고딕" w:hint="eastAsia"/>
+          <w:color w:val="000000"/>
+        </w:rPr>
+        <w:t xml:space="preserve">설치 확인</w:t>
+      </w:r>
+    </w:p>
+    <w:tbl>
+      <w:tblPr>
+        <w:tblStyle w:val="af"/>
+        <w:tblW w:w="0" w:type="auto"/>
+        <w:tblInd w:w="400" w:type="dxa"/>
+        <w:tblLook w:val="04A0" w:firstRow="1" w:lastRow="0" w:firstColumn="1" w:lastColumn="0" w:noHBand="0" w:noVBand="1"/>
+      </w:tblPr>
+      <w:tblGrid>
+        <w:gridCol w:w="8546"/>
+      </w:tblGrid>
+      <w:tr>
+        <w:trPr>
+          <w:cantSplit/>
+        </w:trPr>
+        <w:tc>
+          <w:tcPr>
+            <w:tcW w:w="8928" w:type="dxa"/>
+            <w:shd w:val="clear" w:color="auto" w:fill="F2F2F2" w:themeFill="background1" w:themeFillShade="F2"/>
+          </w:tcPr>
+          <w:p>
+            <w:pPr>
+              <w:pStyle w:val="12"/>
+              <w:jc w:val="left"/>
+            </w:pPr>
+            <w:r>
+              <w:t xml:space="preserve">$ docker compose run --rm rmp python scripts/check_setup.py</w:t>
             </w:r>
           </w:p>
           <w:p>
@@ -2731,7 +3256,7 @@
                 <w:sz w:val="20"/>
                 <w:szCs w:val="20"/>
               </w:rPr>
-              <w:t xml:space="preserve">[3/5] Project code (ikeee)</w:t>
+              <w:t xml:space="preserve">[1/5] Python packages</w:t>
             </w:r>
           </w:p>
           <w:p>
@@ -2762,7 +3287,7 @@
                 <w:sz w:val="20"/>
                 <w:szCs w:val="20"/>
               </w:rPr>
-              <w:t xml:space="preserve">  OK       ikeee.bratlab_dataset, ikeee.model</w:t>
+              <w:t xml:space="preserve">  OK       torch ...</w:t>
             </w:r>
           </w:p>
           <w:p>
@@ -2793,7 +3318,7 @@
                 <w:sz w:val="20"/>
                 <w:szCs w:val="20"/>
               </w:rPr>
-              <w:t xml:space="preserve">[4/5] Dataset: /workspace/data</w:t>
+              <w:t xml:space="preserve">...</w:t>
             </w:r>
           </w:p>
           <w:p>
@@ -2824,7 +3349,7 @@
                 <w:sz w:val="20"/>
                 <w:szCs w:val="20"/>
               </w:rPr>
-              <w:t xml:space="preserve">  OK       stations_position.txt (2000 samples)</w:t>
+              <w:t xml:space="preserve">[2/5] GPU</w:t>
             </w:r>
           </w:p>
           <w:p>
@@ -2855,7 +3380,7 @@
                 <w:sz w:val="20"/>
                 <w:szCs w:val="20"/>
               </w:rPr>
-              <w:t xml:space="preserve">  OK       buildings_position (2000 files)</w:t>
+              <w:t xml:space="preserve">  OK       cuda:0  NVIDIA GeForce RTX 2080 Ti</w:t>
             </w:r>
           </w:p>
           <w:p>
@@ -2886,7 +3411,7 @@
                 <w:sz w:val="20"/>
                 <w:szCs w:val="20"/>
               </w:rPr>
-              <w:t xml:space="preserve">  OK       receivedpower_1750MHz_mat (2000 files)</w:t>
+              <w:t xml:space="preserve">[3/5] Project code (ikeee)</w:t>
             </w:r>
           </w:p>
           <w:p>
@@ -2917,7 +3442,7 @@
                 <w:sz w:val="20"/>
                 <w:szCs w:val="20"/>
               </w:rPr>
-              <w:t xml:space="preserve">...</w:t>
+              <w:t xml:space="preserve">  OK       ikeee.bratlab_dataset, ikeee.model</w:t>
             </w:r>
           </w:p>
           <w:p>
@@ -2948,7 +3473,7 @@
                 <w:sz w:val="20"/>
                 <w:szCs w:val="20"/>
               </w:rPr>
-              <w:t xml:space="preserve">[5/5] Checkpoints: /workspace/model_checkpoints</w:t>
+              <w:t xml:space="preserve">[4/5] Dataset: /workspace/data</w:t>
             </w:r>
           </w:p>
           <w:p>
@@ -2979,7 +3504,7 @@
                 <w:sz w:val="20"/>
                 <w:szCs w:val="20"/>
               </w:rPr>
-              <w:t xml:space="preserve">  model                    1750   2750   3750   4750   5750</w:t>
+              <w:t xml:space="preserve">  OK       stations_position.txt (2000 samples)</w:t>
             </w:r>
           </w:p>
           <w:p>
@@ -3010,7 +3535,7 @@
                 <w:sz w:val="20"/>
                 <w:szCs w:val="20"/>
               </w:rPr>
-              <w:t xml:space="preserve">  radiounet_small             O      O      O      O      O</w:t>
+              <w:t xml:space="preserve">  OK       buildings_position (2000 files)</w:t>
             </w:r>
           </w:p>
           <w:p>
@@ -3041,7 +3566,7 @@
                 <w:sz w:val="20"/>
                 <w:szCs w:val="20"/>
               </w:rPr>
-              <w:t xml:space="preserve">...</w:t>
+              <w:t xml:space="preserve">  OK       receivedpower_1750MHz_mat (2000 files)</w:t>
             </w:r>
           </w:p>
           <w:p>
@@ -3072,7 +3597,7 @@
                 <w:sz w:val="20"/>
                 <w:szCs w:val="20"/>
               </w:rPr>
-              <w:t xml:space="preserve"/>
+              <w:t xml:space="preserve">...</w:t>
             </w:r>
           </w:p>
           <w:p>
@@ -3103,6 +3628,161 @@
                 <w:sz w:val="20"/>
                 <w:szCs w:val="20"/>
               </w:rPr>
+              <w:t xml:space="preserve">[5/5] Checkpoints: /workspace/model_checkpoints</w:t>
+            </w:r>
+          </w:p>
+          <w:p>
+            <w:pPr>
+              <w:pStyle w:val="HTML"/>
+              <w:pBdr>
+                <w:top w:val="single" w:sz="6" w:space="6" w:color="CCCCCC"/>
+                <w:left w:val="single" w:sz="6" w:space="6" w:color="CCCCCC"/>
+                <w:bottom w:val="single" w:sz="6" w:space="6" w:color="CCCCCC"/>
+                <w:right w:val="single" w:sz="6" w:space="6" w:color="CCCCCC"/>
+              </w:pBdr>
+              <w:shd w:val="clear" w:color="auto" w:fill="F8F8F8"/>
+              <w:spacing w:line="239" w:lineRule="atLeast"/>
+              <w:jc w:val="left"/>
+              <w:rPr>
+                <w:rFonts w:ascii="Consolas" w:hAnsi="Consolas" w:cs="Consolas"/>
+                <w:color w:val="000000"/>
+                <w:spacing w:val="4"/>
+                <w:sz w:val="20"/>
+                <w:szCs w:val="20"/>
+              </w:rPr>
+            </w:pPr>
+            <w:r>
+              <w:rPr>
+                <w:rFonts w:ascii="Consolas" w:hAnsi="Consolas" w:cs="Consolas"/>
+                <w:color w:val="000000"/>
+                <w:spacing w:val="4"/>
+                <w:sz w:val="20"/>
+                <w:szCs w:val="20"/>
+              </w:rPr>
+              <w:t xml:space="preserve">  model                    1750   2750   3750   4750   5750</w:t>
+            </w:r>
+          </w:p>
+          <w:p>
+            <w:pPr>
+              <w:pStyle w:val="HTML"/>
+              <w:pBdr>
+                <w:top w:val="single" w:sz="6" w:space="6" w:color="CCCCCC"/>
+                <w:left w:val="single" w:sz="6" w:space="6" w:color="CCCCCC"/>
+                <w:bottom w:val="single" w:sz="6" w:space="6" w:color="CCCCCC"/>
+                <w:right w:val="single" w:sz="6" w:space="6" w:color="CCCCCC"/>
+              </w:pBdr>
+              <w:shd w:val="clear" w:color="auto" w:fill="F8F8F8"/>
+              <w:spacing w:line="239" w:lineRule="atLeast"/>
+              <w:jc w:val="left"/>
+              <w:rPr>
+                <w:rFonts w:ascii="Consolas" w:hAnsi="Consolas" w:cs="Consolas"/>
+                <w:color w:val="000000"/>
+                <w:spacing w:val="4"/>
+                <w:sz w:val="20"/>
+                <w:szCs w:val="20"/>
+              </w:rPr>
+            </w:pPr>
+            <w:r>
+              <w:rPr>
+                <w:rFonts w:ascii="Consolas" w:hAnsi="Consolas" w:cs="Consolas"/>
+                <w:color w:val="000000"/>
+                <w:spacing w:val="4"/>
+                <w:sz w:val="20"/>
+                <w:szCs w:val="20"/>
+              </w:rPr>
+              <w:t xml:space="preserve">  radiounet_small             O      O      O      O      O</w:t>
+            </w:r>
+          </w:p>
+          <w:p>
+            <w:pPr>
+              <w:pStyle w:val="HTML"/>
+              <w:pBdr>
+                <w:top w:val="single" w:sz="6" w:space="6" w:color="CCCCCC"/>
+                <w:left w:val="single" w:sz="6" w:space="6" w:color="CCCCCC"/>
+                <w:bottom w:val="single" w:sz="6" w:space="6" w:color="CCCCCC"/>
+                <w:right w:val="single" w:sz="6" w:space="6" w:color="CCCCCC"/>
+              </w:pBdr>
+              <w:shd w:val="clear" w:color="auto" w:fill="F8F8F8"/>
+              <w:spacing w:line="239" w:lineRule="atLeast"/>
+              <w:jc w:val="left"/>
+              <w:rPr>
+                <w:rFonts w:ascii="Consolas" w:hAnsi="Consolas" w:cs="Consolas"/>
+                <w:color w:val="000000"/>
+                <w:spacing w:val="4"/>
+                <w:sz w:val="20"/>
+                <w:szCs w:val="20"/>
+              </w:rPr>
+            </w:pPr>
+            <w:r>
+              <w:rPr>
+                <w:rFonts w:ascii="Consolas" w:hAnsi="Consolas" w:cs="Consolas"/>
+                <w:color w:val="000000"/>
+                <w:spacing w:val="4"/>
+                <w:sz w:val="20"/>
+                <w:szCs w:val="20"/>
+              </w:rPr>
+              <w:t xml:space="preserve">...</w:t>
+            </w:r>
+          </w:p>
+          <w:p>
+            <w:pPr>
+              <w:pStyle w:val="HTML"/>
+              <w:pBdr>
+                <w:top w:val="single" w:sz="6" w:space="6" w:color="CCCCCC"/>
+                <w:left w:val="single" w:sz="6" w:space="6" w:color="CCCCCC"/>
+                <w:bottom w:val="single" w:sz="6" w:space="6" w:color="CCCCCC"/>
+                <w:right w:val="single" w:sz="6" w:space="6" w:color="CCCCCC"/>
+              </w:pBdr>
+              <w:shd w:val="clear" w:color="auto" w:fill="F8F8F8"/>
+              <w:spacing w:line="239" w:lineRule="atLeast"/>
+              <w:jc w:val="left"/>
+              <w:rPr>
+                <w:rFonts w:ascii="Consolas" w:hAnsi="Consolas" w:cs="Consolas"/>
+                <w:color w:val="000000"/>
+                <w:spacing w:val="4"/>
+                <w:sz w:val="20"/>
+                <w:szCs w:val="20"/>
+              </w:rPr>
+            </w:pPr>
+            <w:r>
+              <w:rPr>
+                <w:rFonts w:ascii="Consolas" w:hAnsi="Consolas" w:cs="Consolas"/>
+                <w:color w:val="000000"/>
+                <w:spacing w:val="4"/>
+                <w:sz w:val="20"/>
+                <w:szCs w:val="20"/>
+              </w:rPr>
+              <w:t xml:space="preserve"/>
+            </w:r>
+          </w:p>
+          <w:p>
+            <w:pPr>
+              <w:pStyle w:val="HTML"/>
+              <w:pBdr>
+                <w:top w:val="single" w:sz="6" w:space="6" w:color="CCCCCC"/>
+                <w:left w:val="single" w:sz="6" w:space="6" w:color="CCCCCC"/>
+                <w:bottom w:val="single" w:sz="6" w:space="6" w:color="CCCCCC"/>
+                <w:right w:val="single" w:sz="6" w:space="6" w:color="CCCCCC"/>
+              </w:pBdr>
+              <w:shd w:val="clear" w:color="auto" w:fill="F8F8F8"/>
+              <w:spacing w:line="239" w:lineRule="atLeast"/>
+              <w:jc w:val="left"/>
+              <w:rPr>
+                <w:rFonts w:ascii="Consolas" w:hAnsi="Consolas" w:cs="Consolas"/>
+                <w:color w:val="000000"/>
+                <w:spacing w:val="4"/>
+                <w:sz w:val="20"/>
+                <w:szCs w:val="20"/>
+              </w:rPr>
+            </w:pPr>
+            <w:r>
+              <w:rPr>
+                <w:rFonts w:ascii="Consolas" w:hAnsi="Consolas" w:cs="Consolas"/>
+                <w:color w:val="000000"/>
+                <w:spacing w:val="4"/>
+                <w:sz w:val="20"/>
+                <w:szCs w:val="20"/>
+              </w:rPr>
               <w:t xml:space="preserve">Result: OK</w:t>
             </w:r>
           </w:p>
@@ -3160,6 +3840,291 @@
         </w:tc>
       </w:tr>
     </w:tbl>
+    <w:p>
+      <w:pPr>
+        <w:pStyle w:val="aa"/>
+        <w:ind w:leftChars="0"/>
+        <w:jc w:val="left"/>
+        <w:rPr>
+          <w:rFonts w:ascii="맑은 고딕" w:eastAsia="맑은 고딕" w:hAnsi="맑은 고딕"/>
+          <w:color w:val="000000"/>
+        </w:rPr>
+      </w:pPr>
+    </w:p>
+    <w:p>
+      <w:pPr>
+        <w:pStyle w:val="aa"/>
+        <w:keepNext/>
+        <w:numPr>
+          <w:ilvl w:val="0"/>
+          <w:numId w:val="105"/>
+        </w:numPr>
+        <w:ind w:leftChars="0"/>
+        <w:jc w:val="left"/>
+        <w:rPr>
+          <w:rFonts w:ascii="맑은 고딕" w:eastAsia="맑은 고딕" w:hAnsi="맑은 고딕"/>
+          <w:color w:val="000000"/>
+        </w:rPr>
+      </w:pPr>
+      <w:r>
+        <w:rPr>
+          <w:rFonts w:ascii="맑은 고딕" w:eastAsia="맑은 고딕" w:hAnsi="맑은 고딕" w:hint="eastAsia"/>
+          <w:color w:val="000000"/>
+        </w:rPr>
+        <w:t xml:space="preserve">테스트 데이터로 동작 확인 (선택)</w:t>
+      </w:r>
+    </w:p>
+    <w:p>
+      <w:pPr>
+        <w:pStyle w:val="aa"/>
+        <w:numPr>
+          <w:ilvl w:val="0"/>
+          <w:numId w:val="6"/>
+        </w:numPr>
+        <w:ind w:leftChars="0"/>
+        <w:jc w:val="left"/>
+        <w:rPr>
+          <w:rFonts w:ascii="맑은 고딕" w:eastAsia="맑은 고딕" w:hAnsi="맑은 고딕"/>
+          <w:color w:val="000000"/>
+        </w:rPr>
+      </w:pPr>
+      <w:r>
+        <w:rPr>
+          <w:rFonts w:ascii="맑은 고딕" w:eastAsia="맑은 고딕" w:hAnsi="맑은 고딕" w:hint="eastAsia"/>
+          <w:color w:val="000000"/>
+        </w:rPr>
+        <w:t xml:space="preserve">전체 데이터셋을 받기 전에 40샘플 테스트 데이터(docker_test_data_40samples.tar.gz)로 학습과 평가가 동작하는지 확인할 수 있다.</w:t>
+      </w:r>
+    </w:p>
+    <w:tbl>
+      <w:tblPr>
+        <w:tblStyle w:val="af"/>
+        <w:tblW w:w="0" w:type="auto"/>
+        <w:tblInd w:w="400" w:type="dxa"/>
+        <w:tblLook w:val="04A0" w:firstRow="1" w:lastRow="0" w:firstColumn="1" w:lastColumn="0" w:noHBand="0" w:noVBand="1"/>
+      </w:tblPr>
+      <w:tblGrid>
+        <w:gridCol w:w="8546"/>
+      </w:tblGrid>
+      <w:tr>
+        <w:trPr>
+          <w:cantSplit/>
+        </w:trPr>
+        <w:tc>
+          <w:tcPr>
+            <w:tcW w:w="8928" w:type="dxa"/>
+            <w:shd w:val="clear" w:color="auto" w:fill="F2F2F2" w:themeFill="background1" w:themeFillShade="F2"/>
+          </w:tcPr>
+          <w:p>
+            <w:pPr>
+              <w:pStyle w:val="aa"/>
+              <w:ind w:leftChars="0" w:left="0"/>
+              <w:jc w:val="left"/>
+              <w:rPr>
+                <w:rFonts w:ascii="맑은 고딕" w:eastAsia="맑은 고딕" w:hAnsi="맑은 고딕"/>
+                <w:color w:val="000000"/>
+              </w:rPr>
+            </w:pPr>
+            <w:r>
+              <w:rPr>
+                <w:rFonts w:ascii="맑은 고딕" w:eastAsia="맑은 고딕" w:hAnsi="맑은 고딕" w:hint="eastAsia"/>
+                <w:color w:val="000000"/>
+              </w:rPr>
+              <w:t xml:space="preserve">// 테스트 데이터 압축 해제 (OutdoorRMP/data 가 생성됨) 후 .env 생성</w:t>
+            </w:r>
+          </w:p>
+          <w:p>
+            <w:pPr>
+              <w:pStyle w:val="12"/>
+              <w:jc w:val="left"/>
+            </w:pPr>
+            <w:r>
+              <w:t xml:space="preserve">$ tar -xzf docker_test_data_40samples.tar.gz -C ~/OutdoorRMP</w:t>
+            </w:r>
+          </w:p>
+          <w:p>
+            <w:pPr>
+              <w:pStyle w:val="12"/>
+              <w:jc w:val="left"/>
+            </w:pPr>
+            <w:r>
+              <w:t xml:space="preserve">$ bash docker/setup_env.sh</w:t>
+            </w:r>
+          </w:p>
+          <w:p>
+            <w:pPr>
+              <w:pStyle w:val="aa"/>
+              <w:ind w:leftChars="0" w:left="0"/>
+              <w:jc w:val="left"/>
+              <w:rPr>
+                <w:rFonts w:ascii="맑은 고딕" w:eastAsia="맑은 고딕" w:hAnsi="맑은 고딕"/>
+                <w:color w:val="000000"/>
+              </w:rPr>
+            </w:pPr>
+            <w:r>
+              <w:rPr>
+                <w:rFonts w:ascii="맑은 고딕" w:eastAsia="맑은 고딕" w:hAnsi="맑은 고딕" w:hint="eastAsia"/>
+                <w:color w:val="000000"/>
+              </w:rPr>
+              <w:t xml:space="preserve">// 설치 확인: 폴더마다 (40 files), 체크포인트는 모두 - 로 표시되면 정상</w:t>
+            </w:r>
+          </w:p>
+          <w:p>
+            <w:pPr>
+              <w:pStyle w:val="12"/>
+              <w:jc w:val="left"/>
+            </w:pPr>
+            <w:r>
+              <w:t xml:space="preserve">$ docker compose run --rm rmp python scripts/check_setup.py</w:t>
+            </w:r>
+          </w:p>
+          <w:p>
+            <w:pPr>
+              <w:pStyle w:val="aa"/>
+              <w:ind w:leftChars="0" w:left="0"/>
+              <w:jc w:val="left"/>
+              <w:rPr>
+                <w:rFonts w:ascii="맑은 고딕" w:eastAsia="맑은 고딕" w:hAnsi="맑은 고딕"/>
+                <w:color w:val="000000"/>
+              </w:rPr>
+            </w:pPr>
+            <w:r>
+              <w:rPr>
+                <w:rFonts w:ascii="맑은 고딕" w:eastAsia="맑은 고딕" w:hAnsi="맑은 고딕" w:hint="eastAsia"/>
+                <w:color w:val="000000"/>
+              </w:rPr>
+              <w:t xml:space="preserve">// 1 epoch 학습 (GPU 메모리가 작은 경우 --batch_size 2)</w:t>
+            </w:r>
+          </w:p>
+          <w:p>
+            <w:pPr>
+              <w:pStyle w:val="12"/>
+              <w:jc w:val="left"/>
+            </w:pPr>
+            <w:r>
+              <w:t xml:space="preserve">$ docker compose run --rm rmp python -m ikeee.bratlab_train --mode train \</w:t>
+            </w:r>
+          </w:p>
+          <w:p>
+            <w:pPr>
+              <w:pStyle w:val="12"/>
+              <w:jc w:val="left"/>
+            </w:pPr>
+            <w:r>
+              <w:t xml:space="preserve">    --root data --freq 4750 --model radiounet --size small \</w:t>
+            </w:r>
+          </w:p>
+          <w:p>
+            <w:pPr>
+              <w:pStyle w:val="12"/>
+              <w:jc w:val="left"/>
+            </w:pPr>
+            <w:r>
+              <w:t xml:space="preserve">    --batch_size 4 --amp --epochs 1 --num_workers 2 \</w:t>
+            </w:r>
+          </w:p>
+          <w:p>
+            <w:pPr>
+              <w:pStyle w:val="12"/>
+              <w:jc w:val="left"/>
+            </w:pPr>
+            <w:r>
+              <w:t xml:space="preserve">    --save_dir model_checkpoints/checkpoints_test_radiounet_small_4750</w:t>
+            </w:r>
+          </w:p>
+          <w:p>
+            <w:pPr>
+              <w:pStyle w:val="aa"/>
+              <w:ind w:leftChars="0" w:left="0"/>
+              <w:jc w:val="left"/>
+              <w:rPr>
+                <w:rFonts w:ascii="맑은 고딕" w:eastAsia="맑은 고딕" w:hAnsi="맑은 고딕"/>
+                <w:color w:val="000000"/>
+              </w:rPr>
+            </w:pPr>
+            <w:r>
+              <w:rPr>
+                <w:rFonts w:ascii="맑은 고딕" w:eastAsia="맑은 고딕" w:hAnsi="맑은 고딕" w:hint="eastAsia"/>
+                <w:color w:val="000000"/>
+              </w:rPr>
+              <w:t xml:space="preserve">// 학습한 체크포인트로 평가</w:t>
+            </w:r>
+          </w:p>
+          <w:p>
+            <w:pPr>
+              <w:pStyle w:val="12"/>
+              <w:jc w:val="left"/>
+            </w:pPr>
+            <w:r>
+              <w:t xml:space="preserve">$ docker compose run --rm rmp python -m ikeee.bratlab_train --mode eval \</w:t>
+            </w:r>
+          </w:p>
+          <w:p>
+            <w:pPr>
+              <w:pStyle w:val="12"/>
+              <w:jc w:val="left"/>
+            </w:pPr>
+            <w:r>
+              <w:t xml:space="preserve">    --root data --freq 4750 --model radiounet --size small \</w:t>
+            </w:r>
+          </w:p>
+          <w:p>
+            <w:pPr>
+              <w:pStyle w:val="12"/>
+              <w:jc w:val="left"/>
+            </w:pPr>
+            <w:r>
+              <w:t xml:space="preserve">    --ckpt model_checkpoints/checkpoints_test_radiounet_small_4750/best.pth \</w:t>
+            </w:r>
+          </w:p>
+          <w:p>
+            <w:pPr>
+              <w:pStyle w:val="12"/>
+              <w:jc w:val="left"/>
+            </w:pPr>
+            <w:r>
+              <w:t xml:space="preserve">    --result_dir runs/eval_test_radiounet_small_4750</w:t>
+            </w:r>
+          </w:p>
+          <w:p>
+            <w:pPr>
+              <w:pStyle w:val="aa"/>
+              <w:ind w:leftChars="0" w:left="0"/>
+              <w:jc w:val="left"/>
+              <w:rPr>
+                <w:rFonts w:ascii="맑은 고딕" w:eastAsia="맑은 고딕" w:hAnsi="맑은 고딕"/>
+                <w:color w:val="000000"/>
+              </w:rPr>
+            </w:pPr>
+            <w:r>
+              <w:rPr>
+                <w:rFonts w:ascii="맑은 고딕" w:eastAsia="맑은 고딕" w:hAnsi="맑은 고딕" w:hint="eastAsia"/>
+                <w:color w:val="000000"/>
+              </w:rPr>
+              <w:t xml:space="preserve">// 끝에 Test RMSE, MAE, Bias, SSIM 표가 출력되면 정상 (1 epoch 학습이므로 오차 값은 큼)</w:t>
+            </w:r>
+          </w:p>
+        </w:tc>
+      </w:tr>
+    </w:tbl>
+    <w:p>
+      <w:pPr>
+        <w:pStyle w:val="aa"/>
+        <w:ind w:leftChars="0"/>
+        <w:jc w:val="left"/>
+        <w:rPr>
+          <w:rFonts w:ascii="맑은 고딕" w:eastAsia="맑은 고딕" w:hAnsi="맑은 고딕"/>
+          <w:color w:val="000000"/>
+        </w:rPr>
+      </w:pPr>
+      <w:r>
+        <w:rPr>
+          <w:rFonts w:ascii="맑은 고딕" w:eastAsia="맑은 고딕" w:hAnsi="맑은 고딕" w:hint="eastAsia"/>
+          <w:color w:val="000000"/>
+        </w:rPr>
+        <w:t xml:space="preserve">※ 확인이 끝나면 data 폴더를 전체 데이터셋으로 교체하고 .env를 다시 생성한다. 테스트용 체크포인트(checkpoints_test_*)와 runs/ 폴더는 삭제해도 된다.</w:t>
+      </w:r>
+    </w:p>
     <w:p>
       <w:pPr>
         <w:pStyle w:val="aa"/>
@@ -5779,7 +6744,7 @@
                 <w:color w:val="000000"/>
                 <w:sz w:val="18"/>
               </w:rPr>
-              <w:t xml:space="preserve">[ERROR] Dataset folder not found</w:t>
+              <w:t xml:space="preserve">[ERROR] Dataset folder not found: ...</w:t>
             </w:r>
           </w:p>
         </w:tc>
@@ -5832,6 +6797,178 @@
                 <w:sz w:val="18"/>
               </w:rPr>
               <w:t xml:space="preserve">경로 확인 후 setup_env.sh 다시 실행</w:t>
+            </w:r>
+          </w:p>
+        </w:tc>
+      </w:tr>
+      <w:tr>
+        <w:trPr>
+          <w:cantSplit/>
+        </w:trPr>
+        <w:tc>
+          <w:tcPr>
+            <w:tcW w:w="3000" w:type="dxa"/>
+            <w:vAlign w:val="center"/>
+          </w:tcPr>
+          <w:p>
+            <w:pPr>
+              <w:pStyle w:val="aa"/>
+              <w:keepNext/>
+              <w:ind w:leftChars="0" w:left="0"/>
+              <w:jc w:val="left"/>
+              <w:rPr>
+                <w:rFonts w:ascii="맑은 고딕" w:eastAsia="맑은 고딕" w:hAnsi="맑은 고딕"/>
+                <w:color w:val="000000"/>
+                <w:sz w:val="18"/>
+              </w:rPr>
+            </w:pPr>
+            <w:r>
+              <w:rPr>
+                <w:rFonts w:ascii="맑은 고딕" w:eastAsia="맑은 고딕" w:hAnsi="맑은 고딕" w:hint="eastAsia"/>
+                <w:color w:val="000000"/>
+                <w:sz w:val="18"/>
+              </w:rPr>
+              <w:t xml:space="preserve">The command 'docker' could not be found in this WSL 2 distro</w:t>
+            </w:r>
+          </w:p>
+        </w:tc>
+        <w:tc>
+          <w:tcPr>
+            <w:tcW w:w="2500" w:type="dxa"/>
+            <w:vAlign w:val="center"/>
+          </w:tcPr>
+          <w:p>
+            <w:pPr>
+              <w:pStyle w:val="aa"/>
+              <w:keepNext/>
+              <w:ind w:leftChars="0" w:left="0"/>
+              <w:jc w:val="left"/>
+              <w:rPr>
+                <w:rFonts w:ascii="맑은 고딕" w:eastAsia="맑은 고딕" w:hAnsi="맑은 고딕"/>
+                <w:color w:val="000000"/>
+                <w:sz w:val="18"/>
+              </w:rPr>
+            </w:pPr>
+            <w:r>
+              <w:rPr>
+                <w:rFonts w:ascii="맑은 고딕" w:eastAsia="맑은 고딕" w:hAnsi="맑은 고딕" w:hint="eastAsia"/>
+                <w:color w:val="000000"/>
+                <w:sz w:val="18"/>
+              </w:rPr>
+              <w:t xml:space="preserve">Docker Desktop의 WSL integration 꺼짐 (Windows)</w:t>
+            </w:r>
+          </w:p>
+        </w:tc>
+        <w:tc>
+          <w:tcPr>
+            <w:tcW w:w="3046" w:type="dxa"/>
+            <w:vAlign w:val="center"/>
+          </w:tcPr>
+          <w:p>
+            <w:pPr>
+              <w:pStyle w:val="aa"/>
+              <w:keepNext/>
+              <w:ind w:leftChars="0" w:left="0"/>
+              <w:jc w:val="left"/>
+              <w:rPr>
+                <w:rFonts w:ascii="맑은 고딕" w:eastAsia="맑은 고딕" w:hAnsi="맑은 고딕"/>
+                <w:color w:val="000000"/>
+                <w:sz w:val="18"/>
+              </w:rPr>
+            </w:pPr>
+            <w:r>
+              <w:rPr>
+                <w:rFonts w:ascii="맑은 고딕" w:eastAsia="맑은 고딕" w:hAnsi="맑은 고딕" w:hint="eastAsia"/>
+                <w:color w:val="000000"/>
+                <w:sz w:val="18"/>
+              </w:rPr>
+              <w:t xml:space="preserve">2.3의 3) 수행 후 Ubuntu 터미널 다시 열기</w:t>
+            </w:r>
+          </w:p>
+        </w:tc>
+      </w:tr>
+      <w:tr>
+        <w:trPr>
+          <w:cantSplit/>
+        </w:trPr>
+        <w:tc>
+          <w:tcPr>
+            <w:tcW w:w="3000" w:type="dxa"/>
+            <w:vAlign w:val="center"/>
+          </w:tcPr>
+          <w:p>
+            <w:pPr>
+              <w:pStyle w:val="aa"/>
+              <w:keepNext/>
+              <w:ind w:leftChars="0" w:left="0"/>
+              <w:jc w:val="left"/>
+              <w:rPr>
+                <w:rFonts w:ascii="맑은 고딕" w:eastAsia="맑은 고딕" w:hAnsi="맑은 고딕"/>
+                <w:color w:val="000000"/>
+                <w:sz w:val="18"/>
+              </w:rPr>
+            </w:pPr>
+            <w:r>
+              <w:rPr>
+                <w:rFonts w:ascii="맑은 고딕" w:eastAsia="맑은 고딕" w:hAnsi="맑은 고딕" w:hint="eastAsia"/>
+                <w:color w:val="000000"/>
+                <w:sz w:val="18"/>
+              </w:rPr>
+              <w:t xml:space="preserve">UserWarning: Applied workaround for CuDNN issue, install nvrtc.so</w:t>
+            </w:r>
+          </w:p>
+        </w:tc>
+        <w:tc>
+          <w:tcPr>
+            <w:tcW w:w="2500" w:type="dxa"/>
+            <w:vAlign w:val="center"/>
+          </w:tcPr>
+          <w:p>
+            <w:pPr>
+              <w:pStyle w:val="aa"/>
+              <w:keepNext/>
+              <w:ind w:leftChars="0" w:left="0"/>
+              <w:jc w:val="left"/>
+              <w:rPr>
+                <w:rFonts w:ascii="맑은 고딕" w:eastAsia="맑은 고딕" w:hAnsi="맑은 고딕"/>
+                <w:color w:val="000000"/>
+                <w:sz w:val="18"/>
+              </w:rPr>
+            </w:pPr>
+            <w:r>
+              <w:rPr>
+                <w:rFonts w:ascii="맑은 고딕" w:eastAsia="맑은 고딕" w:hAnsi="맑은 고딕" w:hint="eastAsia"/>
+                <w:color w:val="000000"/>
+                <w:sz w:val="18"/>
+              </w:rPr>
+              <w:t xml:space="preserve">PyTorch 2.2 CUDA 라이브러리 경고</w:t>
+            </w:r>
+          </w:p>
+        </w:tc>
+        <w:tc>
+          <w:tcPr>
+            <w:tcW w:w="3046" w:type="dxa"/>
+            <w:vAlign w:val="center"/>
+          </w:tcPr>
+          <w:p>
+            <w:pPr>
+              <w:pStyle w:val="aa"/>
+              <w:keepNext/>
+              <w:ind w:leftChars="0" w:left="0"/>
+              <w:jc w:val="left"/>
+              <w:rPr>
+                <w:rFonts w:ascii="맑은 고딕" w:eastAsia="맑은 고딕" w:hAnsi="맑은 고딕"/>
+                <w:color w:val="000000"/>
+                <w:sz w:val="18"/>
+              </w:rPr>
+            </w:pPr>
+            <w:r>
+              <w:rPr>
+                <w:rFonts w:ascii="맑은 고딕" w:eastAsia="맑은 고딕" w:hAnsi="맑은 고딕" w:hint="eastAsia"/>
+                <w:color w:val="000000"/>
+                <w:sz w:val="18"/>
+              </w:rPr>
+              <w:t xml:space="preserve">무시 가능, 결과에 영향 없음</w:t>
             </w:r>
           </w:p>
         </w:tc>
@@ -8440,6 +9577,12 @@
     </w:lvlOverride>
   </w:num>
   <w:num w:numId="109">
+    <w:abstractNumId w:val="11"/>
+    <w:lvlOverride w:ilvl="0">
+      <w:startOverride w:val="1"/>
+    </w:lvlOverride>
+  </w:num>
+  <w:num w:numId="110">
     <w:abstractNumId w:val="11"/>
     <w:lvlOverride w:ilvl="0">
       <w:startOverride w:val="1"/>

</xml_diff>

<commit_message>
Drop commit hash from the delivery folder listing in the manual
Co-Authored-By: Claude Fable 5.1 <noreply@anthropic.com>
</commit_message>
<xml_diff>
--- a/docs/[OutdoorRMP]설치메뉴얼.docx
+++ b/docs/[OutdoorRMP]설치메뉴얼.docx
@@ -247,7 +247,7 @@
               <w:jc w:val="left"/>
             </w:pPr>
             <w:r>
-              <w:t xml:space="preserve">|   |-- OutdoorRMP                                전체 소스 코드 (GitHub main, 커밋 84dea0e)</w:t>
+              <w:t xml:space="preserve">|   |-- OutdoorRMP                                전체 소스 코드 (GitHub james4510/OutdoorRMP main 과 동일)</w:t>
             </w:r>
           </w:p>
           <w:p>
@@ -256,7 +256,7 @@
               <w:jc w:val="left"/>
             </w:pPr>
             <w:r>
-              <w:t xml:space="preserve">|   |-- OutdoorRMP_main_84dea0e.zip               동일 소스 코드의 zip</w:t>
+              <w:t xml:space="preserve">|   |-- OutdoorRMP_main_&lt;커밋&gt;.zip                동일 소스 코드의 zip</w:t>
             </w:r>
           </w:p>
           <w:p>

</xml_diff>